<commit_message>
Ran a simulation test
</commit_message>
<xml_diff>
--- a/src/Черновик.docx
+++ b/src/Черновик.docx
@@ -17536,1673 +17536,16 @@
         <w:pStyle w:val="2"/>
       </w:pPr>
       <w:r>
-        <w:t>3.3 Имитационные тесты</w:t>
-      </w:r>
-    </w:p>
-    <w:p>
-      <w:r>
-        <w:t xml:space="preserve">Проведём радиолокационный тест, цель которого — оценить пригодность последовательности Шапиро для задач обнаружения сигналов на фоне шума и при наличии нескольких </w:t>
-      </w:r>
-      <w:r>
-        <w:t>целей</w:t>
-      </w:r>
-      <w:r>
-        <w:t xml:space="preserve"> Идея заключается в том, что форма автокорреляционной функции влияет на способность системы различать близко расположенные отражённые импульсы. Хорошая последовательность должна </w:t>
-      </w:r>
-      <w:r>
-        <w:lastRenderedPageBreak/>
-        <w:t>давать узкий и высокий главный пик при минимальных боковых лепестках. Это обеспечивает уверенное выделение сигналов даже при наличии шу</w:t>
-      </w:r>
-      <w:r>
-        <w:t>мов и наложении сигнала.</w:t>
-      </w:r>
-    </w:p>
-    <w:p>
-      <w:r>
-        <w:t>В эксперименте передаётся короткий импульс, сформированный по двум вид</w:t>
-      </w:r>
-      <w:r>
-        <w:t>ам последовательностей</w:t>
-      </w:r>
-      <w:r>
-        <w:t xml:space="preserve">. </w:t>
-      </w:r>
-      <w:r>
-        <w:t>Сравниваются п</w:t>
-      </w:r>
-      <w:r>
-        <w:t xml:space="preserve">оследовательность Шапиро </w:t>
-      </w:r>
-      <w:r>
-        <w:t>и</w:t>
-      </w:r>
-      <w:r>
-        <w:t xml:space="preserve"> </w:t>
-      </w:r>
-      <w:r>
-        <w:t xml:space="preserve">случайная последовательность длиной 64 из элементов </w:t>
-      </w:r>
-      <m:oMath>
-        <m:r>
-          <w:rPr>
-            <w:rFonts w:ascii="Cambria Math" w:hAnsi="Cambria Math"/>
-          </w:rPr>
-          <m:t>±1</m:t>
-        </m:r>
-      </m:oMath>
-      <w:r>
-        <w:t>.</w:t>
-      </w:r>
-    </w:p>
-    <w:p>
-      <w:r>
-        <w:t>Имитация отражений моделируется с помощью нескольких целей, находящихся на разных расстояниях. Для каждой цели задаётся амплитуда отражённого сигнала и задержка относительно момента посылки импульса. Таким образом, принимаемый сигнал представляет собой сумму отражённых копий исходного импульса, искажённых шумом. Детектор выполняет кросс-корреляцию принятого сигнала с исходной последовательностью и фиксиру</w:t>
-      </w:r>
-      <w:r>
-        <w:t>ет пики, соответствующие целям.</w:t>
-      </w:r>
-    </w:p>
-    <w:p>
-      <w:r>
-        <w:t>В таблице ниже показаны результаты для трёх сценариев, где расстояние между целями изменяется (параметр Δ) и амплитуда второго отклика уменьшается. Ожидаемые задержки указаны в миллисекундах, амплитуды — нормированы относительно максимума корреляции.</w:t>
-      </w:r>
-    </w:p>
-    <w:p>
-      <w:pPr>
-        <w:pStyle w:val="af1"/>
-        <w:spacing w:before="240" w:after="0"/>
-      </w:pPr>
-      <w:r>
-        <w:t xml:space="preserve">Таблица 1. </w:t>
-      </w:r>
-      <w:proofErr w:type="gramStart"/>
-      <w:r>
-        <w:t>Результаты обнаружения двух целей используя</w:t>
-      </w:r>
-      <w:proofErr w:type="gramEnd"/>
-      <w:r>
-        <w:t xml:space="preserve"> сигнал в виде последовательности Шапиро и случайной последовательности.</w:t>
-      </w:r>
-    </w:p>
-    <w:tbl>
-      <w:tblPr>
-        <w:tblStyle w:val="af6"/>
-        <w:tblW w:w="0" w:type="auto"/>
-        <w:tblLayout w:type="fixed"/>
-        <w:tblLook w:val="06A0" w:firstRow="1" w:lastRow="0" w:firstColumn="1" w:lastColumn="0" w:noHBand="1" w:noVBand="1"/>
-      </w:tblPr>
-      <w:tblGrid>
-        <w:gridCol w:w="1242"/>
-        <w:gridCol w:w="1418"/>
-        <w:gridCol w:w="1411"/>
-        <w:gridCol w:w="1931"/>
-        <w:gridCol w:w="1293"/>
-        <w:gridCol w:w="1267"/>
-        <w:gridCol w:w="1292"/>
-      </w:tblGrid>
-      <w:tr>
-        <w:trPr>
-          <w:cnfStyle w:val="100000000000" w:firstRow="1" w:lastRow="0" w:firstColumn="0" w:lastColumn="0" w:oddVBand="0" w:evenVBand="0" w:oddHBand="0" w:evenHBand="0" w:firstRowFirstColumn="0" w:firstRowLastColumn="0" w:lastRowFirstColumn="0" w:lastRowLastColumn="0"/>
-          <w:trHeight w:val="246"/>
-        </w:trPr>
-        <w:tc>
-          <w:tcPr>
-            <w:cnfStyle w:val="001000000000" w:firstRow="0" w:lastRow="0" w:firstColumn="1" w:lastColumn="0" w:oddVBand="0" w:evenVBand="0" w:oddHBand="0" w:evenHBand="0" w:firstRowFirstColumn="0" w:firstRowLastColumn="0" w:lastRowFirstColumn="0" w:lastRowLastColumn="0"/>
-            <w:tcW w:w="1242" w:type="dxa"/>
-            <w:vAlign w:val="center"/>
-          </w:tcPr>
-          <w:p>
-            <w:pPr>
-              <w:spacing w:line="240" w:lineRule="auto"/>
-              <w:ind w:firstLine="0"/>
-              <w:jc w:val="center"/>
-              <w:rPr>
-                <w:b w:val="0"/>
-                <w:sz w:val="20"/>
-                <w:szCs w:val="20"/>
-              </w:rPr>
-            </w:pPr>
-            <w:r>
-              <w:t>Δ</w:t>
-            </w:r>
-            <w:r>
-              <w:rPr>
-                <w:b w:val="0"/>
-                <w:sz w:val="20"/>
-                <w:szCs w:val="20"/>
-              </w:rPr>
-              <w:t xml:space="preserve"> </w:t>
-            </w:r>
-          </w:p>
-        </w:tc>
-        <w:tc>
-          <w:tcPr>
-            <w:tcW w:w="1418" w:type="dxa"/>
-            <w:vAlign w:val="center"/>
-          </w:tcPr>
-          <w:p>
-            <w:pPr>
-              <w:spacing w:line="240" w:lineRule="auto"/>
-              <w:ind w:firstLine="0"/>
-              <w:jc w:val="center"/>
-              <w:cnfStyle w:val="100000000000" w:firstRow="1" w:lastRow="0" w:firstColumn="0" w:lastColumn="0" w:oddVBand="0" w:evenVBand="0" w:oddHBand="0" w:evenHBand="0" w:firstRowFirstColumn="0" w:firstRowLastColumn="0" w:lastRowFirstColumn="0" w:lastRowLastColumn="0"/>
-              <w:rPr>
-                <w:b w:val="0"/>
-                <w:sz w:val="20"/>
-                <w:szCs w:val="20"/>
-              </w:rPr>
-            </w:pPr>
-            <w:r>
-              <w:rPr>
-                <w:b w:val="0"/>
-                <w:sz w:val="20"/>
-                <w:szCs w:val="20"/>
-              </w:rPr>
-              <w:t>Номер цели</w:t>
-            </w:r>
-          </w:p>
-        </w:tc>
-        <w:tc>
-          <w:tcPr>
-            <w:tcW w:w="1411" w:type="dxa"/>
-            <w:vAlign w:val="center"/>
-          </w:tcPr>
-          <w:p>
-            <w:pPr>
-              <w:spacing w:line="240" w:lineRule="auto"/>
-              <w:ind w:firstLine="0"/>
-              <w:jc w:val="center"/>
-              <w:cnfStyle w:val="100000000000" w:firstRow="1" w:lastRow="0" w:firstColumn="0" w:lastColumn="0" w:oddVBand="0" w:evenVBand="0" w:oddHBand="0" w:evenHBand="0" w:firstRowFirstColumn="0" w:firstRowLastColumn="0" w:lastRowFirstColumn="0" w:lastRowLastColumn="0"/>
-              <w:rPr>
-                <w:b w:val="0"/>
-                <w:sz w:val="20"/>
-                <w:szCs w:val="20"/>
-                <w:lang w:val="en-US"/>
-              </w:rPr>
-            </w:pPr>
-            <w:r>
-              <w:rPr>
-                <w:b w:val="0"/>
-                <w:sz w:val="20"/>
-                <w:szCs w:val="20"/>
-              </w:rPr>
-              <w:t>Задержка</w:t>
-            </w:r>
-            <w:r>
-              <w:rPr>
-                <w:b w:val="0"/>
-                <w:sz w:val="20"/>
-                <w:szCs w:val="20"/>
-                <w:lang w:val="en-US"/>
-              </w:rPr>
-              <w:t>,</w:t>
-            </w:r>
-            <w:r>
-              <w:rPr>
-                <w:b w:val="0"/>
-                <w:sz w:val="20"/>
-                <w:szCs w:val="20"/>
-              </w:rPr>
-              <w:t xml:space="preserve"> </w:t>
-            </w:r>
-            <w:proofErr w:type="spellStart"/>
-            <w:r>
-              <w:rPr>
-                <w:b w:val="0"/>
-                <w:sz w:val="20"/>
-                <w:szCs w:val="20"/>
-              </w:rPr>
-              <w:t>мс</w:t>
-            </w:r>
-            <w:proofErr w:type="spellEnd"/>
-          </w:p>
-        </w:tc>
-        <w:tc>
-          <w:tcPr>
-            <w:tcW w:w="1931" w:type="dxa"/>
-            <w:vAlign w:val="center"/>
-          </w:tcPr>
-          <w:p>
-            <w:pPr>
-              <w:spacing w:line="240" w:lineRule="auto"/>
-              <w:ind w:firstLine="0"/>
-              <w:jc w:val="center"/>
-              <w:cnfStyle w:val="100000000000" w:firstRow="1" w:lastRow="0" w:firstColumn="0" w:lastColumn="0" w:oddVBand="0" w:evenVBand="0" w:oddHBand="0" w:evenHBand="0" w:firstRowFirstColumn="0" w:firstRowLastColumn="0" w:lastRowFirstColumn="0" w:lastRowLastColumn="0"/>
-              <w:rPr>
-                <w:b w:val="0"/>
-                <w:sz w:val="20"/>
-                <w:szCs w:val="20"/>
-              </w:rPr>
-            </w:pPr>
-            <w:r>
-              <w:rPr>
-                <w:b w:val="0"/>
-                <w:sz w:val="20"/>
-                <w:szCs w:val="20"/>
-              </w:rPr>
-              <w:t>Амплитуда (Шапиро)</w:t>
-            </w:r>
-          </w:p>
-        </w:tc>
-        <w:tc>
-          <w:tcPr>
-            <w:tcW w:w="1293" w:type="dxa"/>
-            <w:vAlign w:val="center"/>
-          </w:tcPr>
-          <w:p>
-            <w:pPr>
-              <w:spacing w:line="240" w:lineRule="auto"/>
-              <w:ind w:firstLine="0"/>
-              <w:jc w:val="center"/>
-              <w:cnfStyle w:val="100000000000" w:firstRow="1" w:lastRow="0" w:firstColumn="0" w:lastColumn="0" w:oddVBand="0" w:evenVBand="0" w:oddHBand="0" w:evenHBand="0" w:firstRowFirstColumn="0" w:firstRowLastColumn="0" w:lastRowFirstColumn="0" w:lastRowLastColumn="0"/>
-              <w:rPr>
-                <w:b w:val="0"/>
-                <w:sz w:val="20"/>
-                <w:szCs w:val="20"/>
-              </w:rPr>
-            </w:pPr>
-            <w:r>
-              <w:rPr>
-                <w:b w:val="0"/>
-                <w:sz w:val="20"/>
-                <w:szCs w:val="20"/>
-              </w:rPr>
-              <w:t>Обнаружено</w:t>
-            </w:r>
-          </w:p>
-          <w:p>
-            <w:pPr>
-              <w:spacing w:line="240" w:lineRule="auto"/>
-              <w:ind w:firstLine="0"/>
-              <w:jc w:val="center"/>
-              <w:cnfStyle w:val="100000000000" w:firstRow="1" w:lastRow="0" w:firstColumn="0" w:lastColumn="0" w:oddVBand="0" w:evenVBand="0" w:oddHBand="0" w:evenHBand="0" w:firstRowFirstColumn="0" w:firstRowLastColumn="0" w:lastRowFirstColumn="0" w:lastRowLastColumn="0"/>
-              <w:rPr>
-                <w:b w:val="0"/>
-                <w:sz w:val="20"/>
-                <w:szCs w:val="20"/>
-              </w:rPr>
-            </w:pPr>
-            <w:r>
-              <w:rPr>
-                <w:b w:val="0"/>
-                <w:sz w:val="20"/>
-                <w:szCs w:val="20"/>
-              </w:rPr>
-              <w:t>(Шапиро)</w:t>
-            </w:r>
-          </w:p>
-        </w:tc>
-        <w:tc>
-          <w:tcPr>
-            <w:tcW w:w="1267" w:type="dxa"/>
-            <w:vAlign w:val="center"/>
-          </w:tcPr>
-          <w:p>
-            <w:pPr>
-              <w:spacing w:line="240" w:lineRule="auto"/>
-              <w:ind w:firstLine="0"/>
-              <w:jc w:val="center"/>
-              <w:cnfStyle w:val="100000000000" w:firstRow="1" w:lastRow="0" w:firstColumn="0" w:lastColumn="0" w:oddVBand="0" w:evenVBand="0" w:oddHBand="0" w:evenHBand="0" w:firstRowFirstColumn="0" w:firstRowLastColumn="0" w:lastRowFirstColumn="0" w:lastRowLastColumn="0"/>
-              <w:rPr>
-                <w:b w:val="0"/>
-                <w:sz w:val="20"/>
-                <w:szCs w:val="20"/>
-              </w:rPr>
-            </w:pPr>
-            <w:r>
-              <w:rPr>
-                <w:b w:val="0"/>
-                <w:sz w:val="20"/>
-                <w:szCs w:val="20"/>
-              </w:rPr>
-              <w:t>Амплитуда</w:t>
-            </w:r>
-          </w:p>
-          <w:p>
-            <w:pPr>
-              <w:spacing w:line="240" w:lineRule="auto"/>
-              <w:ind w:firstLine="0"/>
-              <w:jc w:val="center"/>
-              <w:cnfStyle w:val="100000000000" w:firstRow="1" w:lastRow="0" w:firstColumn="0" w:lastColumn="0" w:oddVBand="0" w:evenVBand="0" w:oddHBand="0" w:evenHBand="0" w:firstRowFirstColumn="0" w:firstRowLastColumn="0" w:lastRowFirstColumn="0" w:lastRowLastColumn="0"/>
-              <w:rPr>
-                <w:b w:val="0"/>
-                <w:sz w:val="20"/>
-                <w:szCs w:val="20"/>
-              </w:rPr>
-            </w:pPr>
-            <w:r>
-              <w:rPr>
-                <w:b w:val="0"/>
-                <w:sz w:val="20"/>
-                <w:szCs w:val="20"/>
-              </w:rPr>
-              <w:t>(Случайная)</w:t>
-            </w:r>
-          </w:p>
-        </w:tc>
-        <w:tc>
-          <w:tcPr>
-            <w:tcW w:w="1292" w:type="dxa"/>
-            <w:vAlign w:val="center"/>
-          </w:tcPr>
-          <w:p>
-            <w:pPr>
-              <w:spacing w:line="240" w:lineRule="auto"/>
-              <w:ind w:firstLine="0"/>
-              <w:jc w:val="center"/>
-              <w:cnfStyle w:val="100000000000" w:firstRow="1" w:lastRow="0" w:firstColumn="0" w:lastColumn="0" w:oddVBand="0" w:evenVBand="0" w:oddHBand="0" w:evenHBand="0" w:firstRowFirstColumn="0" w:firstRowLastColumn="0" w:lastRowFirstColumn="0" w:lastRowLastColumn="0"/>
-              <w:rPr>
-                <w:b w:val="0"/>
-                <w:sz w:val="20"/>
-                <w:szCs w:val="20"/>
-              </w:rPr>
-            </w:pPr>
-            <w:r>
-              <w:rPr>
-                <w:b w:val="0"/>
-                <w:sz w:val="20"/>
-                <w:szCs w:val="20"/>
-              </w:rPr>
-              <w:t>Обнаружено</w:t>
-            </w:r>
-          </w:p>
-          <w:p>
-            <w:pPr>
-              <w:spacing w:line="240" w:lineRule="auto"/>
-              <w:ind w:firstLine="0"/>
-              <w:jc w:val="center"/>
-              <w:cnfStyle w:val="100000000000" w:firstRow="1" w:lastRow="0" w:firstColumn="0" w:lastColumn="0" w:oddVBand="0" w:evenVBand="0" w:oddHBand="0" w:evenHBand="0" w:firstRowFirstColumn="0" w:firstRowLastColumn="0" w:lastRowFirstColumn="0" w:lastRowLastColumn="0"/>
-              <w:rPr>
-                <w:b w:val="0"/>
-                <w:sz w:val="20"/>
-                <w:szCs w:val="20"/>
-              </w:rPr>
-            </w:pPr>
-            <w:proofErr w:type="gramStart"/>
-            <w:r>
-              <w:rPr>
-                <w:b w:val="0"/>
-                <w:sz w:val="20"/>
-                <w:szCs w:val="20"/>
-              </w:rPr>
-              <w:t>(Случайная</w:t>
-            </w:r>
-            <w:proofErr w:type="gramEnd"/>
-          </w:p>
-        </w:tc>
-      </w:tr>
-      <w:tr>
-        <w:trPr>
-          <w:trHeight w:val="483"/>
-        </w:trPr>
-        <w:tc>
-          <w:tcPr>
-            <w:cnfStyle w:val="001000000000" w:firstRow="0" w:lastRow="0" w:firstColumn="1" w:lastColumn="0" w:oddVBand="0" w:evenVBand="0" w:oddHBand="0" w:evenHBand="0" w:firstRowFirstColumn="0" w:firstRowLastColumn="0" w:lastRowFirstColumn="0" w:lastRowLastColumn="0"/>
-            <w:tcW w:w="1242" w:type="dxa"/>
-            <w:vAlign w:val="bottom"/>
-          </w:tcPr>
-          <w:p>
-            <w:pPr>
-              <w:ind w:firstLine="0"/>
-              <w:jc w:val="center"/>
-              <w:rPr>
-                <w:rFonts w:cs="Times New Roman"/>
-                <w:b w:val="0"/>
-                <w:color w:val="000000" w:themeColor="text1"/>
-                <w:sz w:val="24"/>
-                <w:szCs w:val="24"/>
-              </w:rPr>
-            </w:pPr>
-            <w:r>
-              <w:rPr>
-                <w:rFonts w:cs="Times New Roman"/>
-                <w:b w:val="0"/>
-                <w:color w:val="000000" w:themeColor="text1"/>
-                <w:sz w:val="24"/>
-                <w:szCs w:val="24"/>
-              </w:rPr>
-              <w:t>4</w:t>
-            </w:r>
-          </w:p>
-        </w:tc>
-        <w:tc>
-          <w:tcPr>
-            <w:tcW w:w="1418" w:type="dxa"/>
-            <w:vAlign w:val="bottom"/>
-          </w:tcPr>
-          <w:p>
-            <w:pPr>
-              <w:ind w:firstLine="0"/>
-              <w:jc w:val="center"/>
-              <w:cnfStyle w:val="000000000000" w:firstRow="0" w:lastRow="0" w:firstColumn="0" w:lastColumn="0" w:oddVBand="0" w:evenVBand="0" w:oddHBand="0" w:evenHBand="0" w:firstRowFirstColumn="0" w:firstRowLastColumn="0" w:lastRowFirstColumn="0" w:lastRowLastColumn="0"/>
-              <w:rPr>
-                <w:rFonts w:cs="Times New Roman"/>
-                <w:color w:val="000000" w:themeColor="text1"/>
-                <w:sz w:val="24"/>
-                <w:szCs w:val="24"/>
-              </w:rPr>
-            </w:pPr>
-            <w:r>
-              <w:rPr>
-                <w:rFonts w:cs="Times New Roman"/>
-                <w:color w:val="000000" w:themeColor="text1"/>
-                <w:sz w:val="24"/>
-                <w:szCs w:val="24"/>
-              </w:rPr>
-              <w:t>1</w:t>
-            </w:r>
-          </w:p>
-        </w:tc>
-        <w:tc>
-          <w:tcPr>
-            <w:tcW w:w="1411" w:type="dxa"/>
-            <w:vAlign w:val="bottom"/>
-          </w:tcPr>
-          <w:p>
-            <w:pPr>
-              <w:ind w:firstLine="0"/>
-              <w:jc w:val="center"/>
-              <w:cnfStyle w:val="000000000000" w:firstRow="0" w:lastRow="0" w:firstColumn="0" w:lastColumn="0" w:oddVBand="0" w:evenVBand="0" w:oddHBand="0" w:evenHBand="0" w:firstRowFirstColumn="0" w:firstRowLastColumn="0" w:lastRowFirstColumn="0" w:lastRowLastColumn="0"/>
-              <w:rPr>
-                <w:rFonts w:cs="Times New Roman"/>
-                <w:color w:val="000000" w:themeColor="text1"/>
-                <w:sz w:val="24"/>
-                <w:szCs w:val="24"/>
-              </w:rPr>
-            </w:pPr>
-            <w:r>
-              <w:rPr>
-                <w:rFonts w:cs="Times New Roman"/>
-                <w:color w:val="000000" w:themeColor="text1"/>
-                <w:sz w:val="24"/>
-                <w:szCs w:val="24"/>
-              </w:rPr>
-              <w:t>0.00040</w:t>
-            </w:r>
-          </w:p>
-        </w:tc>
-        <w:tc>
-          <w:tcPr>
-            <w:tcW w:w="1931" w:type="dxa"/>
-            <w:vAlign w:val="bottom"/>
-          </w:tcPr>
-          <w:p>
-            <w:pPr>
-              <w:ind w:firstLine="0"/>
-              <w:jc w:val="center"/>
-              <w:cnfStyle w:val="000000000000" w:firstRow="0" w:lastRow="0" w:firstColumn="0" w:lastColumn="0" w:oddVBand="0" w:evenVBand="0" w:oddHBand="0" w:evenHBand="0" w:firstRowFirstColumn="0" w:firstRowLastColumn="0" w:lastRowFirstColumn="0" w:lastRowLastColumn="0"/>
-              <w:rPr>
-                <w:rFonts w:cs="Times New Roman"/>
-                <w:color w:val="000000" w:themeColor="text1"/>
-                <w:sz w:val="24"/>
-                <w:szCs w:val="24"/>
-              </w:rPr>
-            </w:pPr>
-            <w:r>
-              <w:rPr>
-                <w:rFonts w:cs="Times New Roman"/>
-                <w:color w:val="000000" w:themeColor="text1"/>
-                <w:sz w:val="24"/>
-                <w:szCs w:val="24"/>
-              </w:rPr>
-              <w:t>1.000000</w:t>
-            </w:r>
-          </w:p>
-        </w:tc>
-        <w:tc>
-          <w:tcPr>
-            <w:tcW w:w="1293" w:type="dxa"/>
-            <w:vAlign w:val="bottom"/>
-          </w:tcPr>
-          <w:p>
-            <w:pPr>
-              <w:ind w:firstLine="0"/>
-              <w:jc w:val="center"/>
-              <w:cnfStyle w:val="000000000000" w:firstRow="0" w:lastRow="0" w:firstColumn="0" w:lastColumn="0" w:oddVBand="0" w:evenVBand="0" w:oddHBand="0" w:evenHBand="0" w:firstRowFirstColumn="0" w:firstRowLastColumn="0" w:lastRowFirstColumn="0" w:lastRowLastColumn="0"/>
-              <w:rPr>
-                <w:rFonts w:cs="Times New Roman"/>
-                <w:color w:val="000000" w:themeColor="text1"/>
-                <w:sz w:val="24"/>
-                <w:szCs w:val="24"/>
-              </w:rPr>
-            </w:pPr>
-            <w:r>
-              <w:rPr>
-                <w:rFonts w:cs="Times New Roman"/>
-                <w:color w:val="000000" w:themeColor="text1"/>
-                <w:sz w:val="24"/>
-                <w:szCs w:val="24"/>
-              </w:rPr>
-              <w:t>Да</w:t>
-            </w:r>
-          </w:p>
-        </w:tc>
-        <w:tc>
-          <w:tcPr>
-            <w:tcW w:w="1267" w:type="dxa"/>
-            <w:vAlign w:val="bottom"/>
-          </w:tcPr>
-          <w:p>
-            <w:pPr>
-              <w:ind w:firstLine="0"/>
-              <w:jc w:val="center"/>
-              <w:cnfStyle w:val="000000000000" w:firstRow="0" w:lastRow="0" w:firstColumn="0" w:lastColumn="0" w:oddVBand="0" w:evenVBand="0" w:oddHBand="0" w:evenHBand="0" w:firstRowFirstColumn="0" w:firstRowLastColumn="0" w:lastRowFirstColumn="0" w:lastRowLastColumn="0"/>
-              <w:rPr>
-                <w:rFonts w:cs="Times New Roman"/>
-                <w:color w:val="000000" w:themeColor="text1"/>
-                <w:sz w:val="24"/>
-                <w:szCs w:val="24"/>
-              </w:rPr>
-            </w:pPr>
-            <w:r>
-              <w:rPr>
-                <w:rFonts w:cs="Times New Roman"/>
-                <w:color w:val="000000" w:themeColor="text1"/>
-                <w:sz w:val="24"/>
-                <w:szCs w:val="24"/>
-              </w:rPr>
-              <w:t>1.000000</w:t>
-            </w:r>
-          </w:p>
-        </w:tc>
-        <w:tc>
-          <w:tcPr>
-            <w:tcW w:w="1292" w:type="dxa"/>
-            <w:vAlign w:val="bottom"/>
-          </w:tcPr>
-          <w:p>
-            <w:pPr>
-              <w:ind w:firstLine="0"/>
-              <w:jc w:val="center"/>
-              <w:cnfStyle w:val="000000000000" w:firstRow="0" w:lastRow="0" w:firstColumn="0" w:lastColumn="0" w:oddVBand="0" w:evenVBand="0" w:oddHBand="0" w:evenHBand="0" w:firstRowFirstColumn="0" w:firstRowLastColumn="0" w:lastRowFirstColumn="0" w:lastRowLastColumn="0"/>
-              <w:rPr>
-                <w:rFonts w:cs="Times New Roman"/>
-                <w:color w:val="000000" w:themeColor="text1"/>
-                <w:sz w:val="24"/>
-                <w:szCs w:val="24"/>
-              </w:rPr>
-            </w:pPr>
-            <w:r>
-              <w:rPr>
-                <w:rFonts w:cs="Times New Roman"/>
-                <w:color w:val="000000" w:themeColor="text1"/>
-                <w:sz w:val="24"/>
-                <w:szCs w:val="24"/>
-              </w:rPr>
-              <w:t>Да</w:t>
-            </w:r>
-          </w:p>
-        </w:tc>
-      </w:tr>
-      <w:tr>
-        <w:trPr>
-          <w:trHeight w:val="483"/>
-        </w:trPr>
-        <w:tc>
-          <w:tcPr>
-            <w:cnfStyle w:val="001000000000" w:firstRow="0" w:lastRow="0" w:firstColumn="1" w:lastColumn="0" w:oddVBand="0" w:evenVBand="0" w:oddHBand="0" w:evenHBand="0" w:firstRowFirstColumn="0" w:firstRowLastColumn="0" w:lastRowFirstColumn="0" w:lastRowLastColumn="0"/>
-            <w:tcW w:w="1242" w:type="dxa"/>
-            <w:vAlign w:val="bottom"/>
-          </w:tcPr>
-          <w:p>
-            <w:pPr>
-              <w:ind w:firstLine="0"/>
-              <w:jc w:val="center"/>
-              <w:rPr>
-                <w:rFonts w:cs="Times New Roman"/>
-                <w:b w:val="0"/>
-                <w:color w:val="000000" w:themeColor="text1"/>
-                <w:sz w:val="24"/>
-                <w:szCs w:val="24"/>
-              </w:rPr>
-            </w:pPr>
-            <w:r>
-              <w:rPr>
-                <w:rFonts w:cs="Times New Roman"/>
-                <w:b w:val="0"/>
-                <w:color w:val="000000" w:themeColor="text1"/>
-                <w:sz w:val="24"/>
-                <w:szCs w:val="24"/>
-              </w:rPr>
-              <w:t>4</w:t>
-            </w:r>
-          </w:p>
-        </w:tc>
-        <w:tc>
-          <w:tcPr>
-            <w:tcW w:w="1418" w:type="dxa"/>
-            <w:vAlign w:val="bottom"/>
-          </w:tcPr>
-          <w:p>
-            <w:pPr>
-              <w:ind w:firstLine="0"/>
-              <w:jc w:val="center"/>
-              <w:cnfStyle w:val="000000000000" w:firstRow="0" w:lastRow="0" w:firstColumn="0" w:lastColumn="0" w:oddVBand="0" w:evenVBand="0" w:oddHBand="0" w:evenHBand="0" w:firstRowFirstColumn="0" w:firstRowLastColumn="0" w:lastRowFirstColumn="0" w:lastRowLastColumn="0"/>
-              <w:rPr>
-                <w:rFonts w:cs="Times New Roman"/>
-                <w:color w:val="000000" w:themeColor="text1"/>
-                <w:sz w:val="24"/>
-                <w:szCs w:val="24"/>
-              </w:rPr>
-            </w:pPr>
-            <w:r>
-              <w:rPr>
-                <w:rFonts w:cs="Times New Roman"/>
-                <w:color w:val="000000" w:themeColor="text1"/>
-                <w:sz w:val="24"/>
-                <w:szCs w:val="24"/>
-              </w:rPr>
-              <w:t>2</w:t>
-            </w:r>
-          </w:p>
-        </w:tc>
-        <w:tc>
-          <w:tcPr>
-            <w:tcW w:w="1411" w:type="dxa"/>
-            <w:vAlign w:val="bottom"/>
-          </w:tcPr>
-          <w:p>
-            <w:pPr>
-              <w:ind w:firstLine="0"/>
-              <w:jc w:val="center"/>
-              <w:cnfStyle w:val="000000000000" w:firstRow="0" w:lastRow="0" w:firstColumn="0" w:lastColumn="0" w:oddVBand="0" w:evenVBand="0" w:oddHBand="0" w:evenHBand="0" w:firstRowFirstColumn="0" w:firstRowLastColumn="0" w:lastRowFirstColumn="0" w:lastRowLastColumn="0"/>
-              <w:rPr>
-                <w:rFonts w:cs="Times New Roman"/>
-                <w:color w:val="000000" w:themeColor="text1"/>
-                <w:sz w:val="24"/>
-                <w:szCs w:val="24"/>
-              </w:rPr>
-            </w:pPr>
-            <w:r>
-              <w:rPr>
-                <w:rFonts w:cs="Times New Roman"/>
-                <w:color w:val="000000" w:themeColor="text1"/>
-                <w:sz w:val="24"/>
-                <w:szCs w:val="24"/>
-              </w:rPr>
-              <w:t>0.00048</w:t>
-            </w:r>
-          </w:p>
-        </w:tc>
-        <w:tc>
-          <w:tcPr>
-            <w:tcW w:w="1931" w:type="dxa"/>
-            <w:vAlign w:val="bottom"/>
-          </w:tcPr>
-          <w:p>
-            <w:pPr>
-              <w:ind w:firstLine="0"/>
-              <w:jc w:val="center"/>
-              <w:cnfStyle w:val="000000000000" w:firstRow="0" w:lastRow="0" w:firstColumn="0" w:lastColumn="0" w:oddVBand="0" w:evenVBand="0" w:oddHBand="0" w:evenHBand="0" w:firstRowFirstColumn="0" w:firstRowLastColumn="0" w:lastRowFirstColumn="0" w:lastRowLastColumn="0"/>
-              <w:rPr>
-                <w:rFonts w:cs="Times New Roman"/>
-                <w:color w:val="000000" w:themeColor="text1"/>
-                <w:sz w:val="24"/>
-                <w:szCs w:val="24"/>
-              </w:rPr>
-            </w:pPr>
-            <w:r>
-              <w:rPr>
-                <w:rFonts w:cs="Times New Roman"/>
-                <w:color w:val="000000" w:themeColor="text1"/>
-                <w:sz w:val="24"/>
-                <w:szCs w:val="24"/>
-              </w:rPr>
-              <w:t>0.909364</w:t>
-            </w:r>
-          </w:p>
-        </w:tc>
-        <w:tc>
-          <w:tcPr>
-            <w:tcW w:w="1293" w:type="dxa"/>
-            <w:vAlign w:val="bottom"/>
-          </w:tcPr>
-          <w:p>
-            <w:pPr>
-              <w:ind w:firstLine="0"/>
-              <w:jc w:val="center"/>
-              <w:cnfStyle w:val="000000000000" w:firstRow="0" w:lastRow="0" w:firstColumn="0" w:lastColumn="0" w:oddVBand="0" w:evenVBand="0" w:oddHBand="0" w:evenHBand="0" w:firstRowFirstColumn="0" w:firstRowLastColumn="0" w:lastRowFirstColumn="0" w:lastRowLastColumn="0"/>
-              <w:rPr>
-                <w:rFonts w:cs="Times New Roman"/>
-                <w:color w:val="000000" w:themeColor="text1"/>
-                <w:sz w:val="24"/>
-                <w:szCs w:val="24"/>
-              </w:rPr>
-            </w:pPr>
-            <w:r>
-              <w:rPr>
-                <w:rFonts w:cs="Times New Roman"/>
-                <w:color w:val="000000" w:themeColor="text1"/>
-                <w:sz w:val="24"/>
-                <w:szCs w:val="24"/>
-              </w:rPr>
-              <w:t>Да</w:t>
-            </w:r>
-          </w:p>
-        </w:tc>
-        <w:tc>
-          <w:tcPr>
-            <w:tcW w:w="1267" w:type="dxa"/>
-            <w:vAlign w:val="bottom"/>
-          </w:tcPr>
-          <w:p>
-            <w:pPr>
-              <w:ind w:firstLine="0"/>
-              <w:jc w:val="center"/>
-              <w:cnfStyle w:val="000000000000" w:firstRow="0" w:lastRow="0" w:firstColumn="0" w:lastColumn="0" w:oddVBand="0" w:evenVBand="0" w:oddHBand="0" w:evenHBand="0" w:firstRowFirstColumn="0" w:firstRowLastColumn="0" w:lastRowFirstColumn="0" w:lastRowLastColumn="0"/>
-              <w:rPr>
-                <w:rFonts w:cs="Times New Roman"/>
-                <w:color w:val="000000" w:themeColor="text1"/>
-                <w:sz w:val="24"/>
-                <w:szCs w:val="24"/>
-              </w:rPr>
-            </w:pPr>
-            <w:r>
-              <w:rPr>
-                <w:rFonts w:cs="Times New Roman"/>
-                <w:color w:val="000000" w:themeColor="text1"/>
-                <w:sz w:val="24"/>
-                <w:szCs w:val="24"/>
-              </w:rPr>
-              <w:t>0.893510</w:t>
-            </w:r>
-          </w:p>
-        </w:tc>
-        <w:tc>
-          <w:tcPr>
-            <w:tcW w:w="1292" w:type="dxa"/>
-            <w:vAlign w:val="bottom"/>
-          </w:tcPr>
-          <w:p>
-            <w:pPr>
-              <w:ind w:firstLine="0"/>
-              <w:jc w:val="center"/>
-              <w:cnfStyle w:val="000000000000" w:firstRow="0" w:lastRow="0" w:firstColumn="0" w:lastColumn="0" w:oddVBand="0" w:evenVBand="0" w:oddHBand="0" w:evenHBand="0" w:firstRowFirstColumn="0" w:firstRowLastColumn="0" w:lastRowFirstColumn="0" w:lastRowLastColumn="0"/>
-              <w:rPr>
-                <w:rFonts w:cs="Times New Roman"/>
-                <w:color w:val="000000" w:themeColor="text1"/>
-                <w:sz w:val="24"/>
-                <w:szCs w:val="24"/>
-              </w:rPr>
-            </w:pPr>
-            <w:r>
-              <w:rPr>
-                <w:rFonts w:cs="Times New Roman"/>
-                <w:color w:val="000000" w:themeColor="text1"/>
-                <w:sz w:val="24"/>
-                <w:szCs w:val="24"/>
-              </w:rPr>
-              <w:t>Да</w:t>
-            </w:r>
-          </w:p>
-        </w:tc>
-      </w:tr>
-      <w:tr>
-        <w:trPr>
-          <w:trHeight w:val="483"/>
-        </w:trPr>
-        <w:tc>
-          <w:tcPr>
-            <w:cnfStyle w:val="001000000000" w:firstRow="0" w:lastRow="0" w:firstColumn="1" w:lastColumn="0" w:oddVBand="0" w:evenVBand="0" w:oddHBand="0" w:evenHBand="0" w:firstRowFirstColumn="0" w:firstRowLastColumn="0" w:lastRowFirstColumn="0" w:lastRowLastColumn="0"/>
-            <w:tcW w:w="1242" w:type="dxa"/>
-            <w:vAlign w:val="bottom"/>
-          </w:tcPr>
-          <w:p>
-            <w:pPr>
-              <w:ind w:firstLine="0"/>
-              <w:jc w:val="center"/>
-              <w:rPr>
-                <w:rFonts w:cs="Times New Roman"/>
-                <w:b w:val="0"/>
-                <w:color w:val="000000" w:themeColor="text1"/>
-                <w:sz w:val="24"/>
-                <w:szCs w:val="24"/>
-              </w:rPr>
-            </w:pPr>
-            <w:r>
-              <w:rPr>
-                <w:rFonts w:cs="Times New Roman"/>
-                <w:b w:val="0"/>
-                <w:color w:val="000000" w:themeColor="text1"/>
-                <w:sz w:val="24"/>
-                <w:szCs w:val="24"/>
-              </w:rPr>
-              <w:t>8</w:t>
-            </w:r>
-          </w:p>
-        </w:tc>
-        <w:tc>
-          <w:tcPr>
-            <w:tcW w:w="1418" w:type="dxa"/>
-            <w:vAlign w:val="bottom"/>
-          </w:tcPr>
-          <w:p>
-            <w:pPr>
-              <w:ind w:firstLine="0"/>
-              <w:jc w:val="center"/>
-              <w:cnfStyle w:val="000000000000" w:firstRow="0" w:lastRow="0" w:firstColumn="0" w:lastColumn="0" w:oddVBand="0" w:evenVBand="0" w:oddHBand="0" w:evenHBand="0" w:firstRowFirstColumn="0" w:firstRowLastColumn="0" w:lastRowFirstColumn="0" w:lastRowLastColumn="0"/>
-              <w:rPr>
-                <w:rFonts w:cs="Times New Roman"/>
-                <w:color w:val="000000" w:themeColor="text1"/>
-                <w:sz w:val="24"/>
-                <w:szCs w:val="24"/>
-              </w:rPr>
-            </w:pPr>
-            <w:r>
-              <w:rPr>
-                <w:rFonts w:cs="Times New Roman"/>
-                <w:color w:val="000000" w:themeColor="text1"/>
-                <w:sz w:val="24"/>
-                <w:szCs w:val="24"/>
-              </w:rPr>
-              <w:t>1</w:t>
-            </w:r>
-          </w:p>
-        </w:tc>
-        <w:tc>
-          <w:tcPr>
-            <w:tcW w:w="1411" w:type="dxa"/>
-            <w:vAlign w:val="bottom"/>
-          </w:tcPr>
-          <w:p>
-            <w:pPr>
-              <w:ind w:firstLine="0"/>
-              <w:jc w:val="center"/>
-              <w:cnfStyle w:val="000000000000" w:firstRow="0" w:lastRow="0" w:firstColumn="0" w:lastColumn="0" w:oddVBand="0" w:evenVBand="0" w:oddHBand="0" w:evenHBand="0" w:firstRowFirstColumn="0" w:firstRowLastColumn="0" w:lastRowFirstColumn="0" w:lastRowLastColumn="0"/>
-              <w:rPr>
-                <w:rFonts w:cs="Times New Roman"/>
-                <w:color w:val="000000" w:themeColor="text1"/>
-                <w:sz w:val="24"/>
-                <w:szCs w:val="24"/>
-              </w:rPr>
-            </w:pPr>
-            <w:r>
-              <w:rPr>
-                <w:rFonts w:cs="Times New Roman"/>
-                <w:color w:val="000000" w:themeColor="text1"/>
-                <w:sz w:val="24"/>
-                <w:szCs w:val="24"/>
-              </w:rPr>
-              <w:t>0.00040</w:t>
-            </w:r>
-          </w:p>
-        </w:tc>
-        <w:tc>
-          <w:tcPr>
-            <w:tcW w:w="1931" w:type="dxa"/>
-            <w:vAlign w:val="bottom"/>
-          </w:tcPr>
-          <w:p>
-            <w:pPr>
-              <w:ind w:firstLine="0"/>
-              <w:jc w:val="center"/>
-              <w:cnfStyle w:val="000000000000" w:firstRow="0" w:lastRow="0" w:firstColumn="0" w:lastColumn="0" w:oddVBand="0" w:evenVBand="0" w:oddHBand="0" w:evenHBand="0" w:firstRowFirstColumn="0" w:firstRowLastColumn="0" w:lastRowFirstColumn="0" w:lastRowLastColumn="0"/>
-              <w:rPr>
-                <w:rFonts w:cs="Times New Roman"/>
-                <w:color w:val="000000" w:themeColor="text1"/>
-                <w:sz w:val="24"/>
-                <w:szCs w:val="24"/>
-              </w:rPr>
-            </w:pPr>
-            <w:r>
-              <w:rPr>
-                <w:rFonts w:cs="Times New Roman"/>
-                <w:color w:val="000000" w:themeColor="text1"/>
-                <w:sz w:val="24"/>
-                <w:szCs w:val="24"/>
-              </w:rPr>
-              <w:t>1.000000</w:t>
-            </w:r>
-          </w:p>
-        </w:tc>
-        <w:tc>
-          <w:tcPr>
-            <w:tcW w:w="1293" w:type="dxa"/>
-            <w:vAlign w:val="bottom"/>
-          </w:tcPr>
-          <w:p>
-            <w:pPr>
-              <w:ind w:firstLine="0"/>
-              <w:jc w:val="center"/>
-              <w:cnfStyle w:val="000000000000" w:firstRow="0" w:lastRow="0" w:firstColumn="0" w:lastColumn="0" w:oddVBand="0" w:evenVBand="0" w:oddHBand="0" w:evenHBand="0" w:firstRowFirstColumn="0" w:firstRowLastColumn="0" w:lastRowFirstColumn="0" w:lastRowLastColumn="0"/>
-              <w:rPr>
-                <w:rFonts w:cs="Times New Roman"/>
-                <w:color w:val="000000" w:themeColor="text1"/>
-                <w:sz w:val="24"/>
-                <w:szCs w:val="24"/>
-              </w:rPr>
-            </w:pPr>
-            <w:r>
-              <w:rPr>
-                <w:rFonts w:cs="Times New Roman"/>
-                <w:color w:val="000000" w:themeColor="text1"/>
-                <w:sz w:val="24"/>
-                <w:szCs w:val="24"/>
-              </w:rPr>
-              <w:t>Да</w:t>
-            </w:r>
-          </w:p>
-        </w:tc>
-        <w:tc>
-          <w:tcPr>
-            <w:tcW w:w="1267" w:type="dxa"/>
-            <w:vAlign w:val="bottom"/>
-          </w:tcPr>
-          <w:p>
-            <w:pPr>
-              <w:ind w:firstLine="0"/>
-              <w:jc w:val="center"/>
-              <w:cnfStyle w:val="000000000000" w:firstRow="0" w:lastRow="0" w:firstColumn="0" w:lastColumn="0" w:oddVBand="0" w:evenVBand="0" w:oddHBand="0" w:evenHBand="0" w:firstRowFirstColumn="0" w:firstRowLastColumn="0" w:lastRowFirstColumn="0" w:lastRowLastColumn="0"/>
-              <w:rPr>
-                <w:rFonts w:cs="Times New Roman"/>
-                <w:color w:val="000000" w:themeColor="text1"/>
-                <w:sz w:val="24"/>
-                <w:szCs w:val="24"/>
-              </w:rPr>
-            </w:pPr>
-            <w:r>
-              <w:rPr>
-                <w:rFonts w:cs="Times New Roman"/>
-                <w:color w:val="000000" w:themeColor="text1"/>
-                <w:sz w:val="24"/>
-                <w:szCs w:val="24"/>
-              </w:rPr>
-              <w:t>1.000000</w:t>
-            </w:r>
-          </w:p>
-        </w:tc>
-        <w:tc>
-          <w:tcPr>
-            <w:tcW w:w="1292" w:type="dxa"/>
-            <w:vAlign w:val="bottom"/>
-          </w:tcPr>
-          <w:p>
-            <w:pPr>
-              <w:ind w:firstLine="0"/>
-              <w:jc w:val="center"/>
-              <w:cnfStyle w:val="000000000000" w:firstRow="0" w:lastRow="0" w:firstColumn="0" w:lastColumn="0" w:oddVBand="0" w:evenVBand="0" w:oddHBand="0" w:evenHBand="0" w:firstRowFirstColumn="0" w:firstRowLastColumn="0" w:lastRowFirstColumn="0" w:lastRowLastColumn="0"/>
-              <w:rPr>
-                <w:rFonts w:cs="Times New Roman"/>
-                <w:color w:val="000000" w:themeColor="text1"/>
-                <w:sz w:val="24"/>
-                <w:szCs w:val="24"/>
-              </w:rPr>
-            </w:pPr>
-            <w:r>
-              <w:rPr>
-                <w:rFonts w:cs="Times New Roman"/>
-                <w:color w:val="000000" w:themeColor="text1"/>
-                <w:sz w:val="24"/>
-                <w:szCs w:val="24"/>
-              </w:rPr>
-              <w:t>Да</w:t>
-            </w:r>
-          </w:p>
-        </w:tc>
-      </w:tr>
-      <w:tr>
-        <w:trPr>
-          <w:trHeight w:val="483"/>
-        </w:trPr>
-        <w:tc>
-          <w:tcPr>
-            <w:cnfStyle w:val="001000000000" w:firstRow="0" w:lastRow="0" w:firstColumn="1" w:lastColumn="0" w:oddVBand="0" w:evenVBand="0" w:oddHBand="0" w:evenHBand="0" w:firstRowFirstColumn="0" w:firstRowLastColumn="0" w:lastRowFirstColumn="0" w:lastRowLastColumn="0"/>
-            <w:tcW w:w="1242" w:type="dxa"/>
-            <w:vAlign w:val="bottom"/>
-          </w:tcPr>
-          <w:p>
-            <w:pPr>
-              <w:ind w:firstLine="0"/>
-              <w:jc w:val="center"/>
-              <w:rPr>
-                <w:rFonts w:cs="Times New Roman"/>
-                <w:b w:val="0"/>
-                <w:color w:val="000000" w:themeColor="text1"/>
-                <w:sz w:val="24"/>
-                <w:szCs w:val="24"/>
-              </w:rPr>
-            </w:pPr>
-            <w:r>
-              <w:rPr>
-                <w:rFonts w:cs="Times New Roman"/>
-                <w:b w:val="0"/>
-                <w:color w:val="000000" w:themeColor="text1"/>
-                <w:sz w:val="24"/>
-                <w:szCs w:val="24"/>
-              </w:rPr>
-              <w:t>8</w:t>
-            </w:r>
-          </w:p>
-        </w:tc>
-        <w:tc>
-          <w:tcPr>
-            <w:tcW w:w="1418" w:type="dxa"/>
-            <w:vAlign w:val="bottom"/>
-          </w:tcPr>
-          <w:p>
-            <w:pPr>
-              <w:ind w:firstLine="0"/>
-              <w:jc w:val="center"/>
-              <w:cnfStyle w:val="000000000000" w:firstRow="0" w:lastRow="0" w:firstColumn="0" w:lastColumn="0" w:oddVBand="0" w:evenVBand="0" w:oddHBand="0" w:evenHBand="0" w:firstRowFirstColumn="0" w:firstRowLastColumn="0" w:lastRowFirstColumn="0" w:lastRowLastColumn="0"/>
-              <w:rPr>
-                <w:rFonts w:cs="Times New Roman"/>
-                <w:color w:val="000000" w:themeColor="text1"/>
-                <w:sz w:val="24"/>
-                <w:szCs w:val="24"/>
-              </w:rPr>
-            </w:pPr>
-            <w:r>
-              <w:rPr>
-                <w:rFonts w:cs="Times New Roman"/>
-                <w:color w:val="000000" w:themeColor="text1"/>
-                <w:sz w:val="24"/>
-                <w:szCs w:val="24"/>
-              </w:rPr>
-              <w:t>2</w:t>
-            </w:r>
-          </w:p>
-        </w:tc>
-        <w:tc>
-          <w:tcPr>
-            <w:tcW w:w="1411" w:type="dxa"/>
-            <w:vAlign w:val="bottom"/>
-          </w:tcPr>
-          <w:p>
-            <w:pPr>
-              <w:ind w:firstLine="0"/>
-              <w:jc w:val="center"/>
-              <w:cnfStyle w:val="000000000000" w:firstRow="0" w:lastRow="0" w:firstColumn="0" w:lastColumn="0" w:oddVBand="0" w:evenVBand="0" w:oddHBand="0" w:evenHBand="0" w:firstRowFirstColumn="0" w:firstRowLastColumn="0" w:lastRowFirstColumn="0" w:lastRowLastColumn="0"/>
-              <w:rPr>
-                <w:rFonts w:cs="Times New Roman"/>
-                <w:color w:val="000000" w:themeColor="text1"/>
-                <w:sz w:val="24"/>
-                <w:szCs w:val="24"/>
-              </w:rPr>
-            </w:pPr>
-            <w:r>
-              <w:rPr>
-                <w:rFonts w:cs="Times New Roman"/>
-                <w:color w:val="000000" w:themeColor="text1"/>
-                <w:sz w:val="24"/>
-                <w:szCs w:val="24"/>
-              </w:rPr>
-              <w:t>0.00056</w:t>
-            </w:r>
-          </w:p>
-        </w:tc>
-        <w:tc>
-          <w:tcPr>
-            <w:tcW w:w="1931" w:type="dxa"/>
-            <w:vAlign w:val="bottom"/>
-          </w:tcPr>
-          <w:p>
-            <w:pPr>
-              <w:ind w:firstLine="0"/>
-              <w:jc w:val="center"/>
-              <w:cnfStyle w:val="000000000000" w:firstRow="0" w:lastRow="0" w:firstColumn="0" w:lastColumn="0" w:oddVBand="0" w:evenVBand="0" w:oddHBand="0" w:evenHBand="0" w:firstRowFirstColumn="0" w:firstRowLastColumn="0" w:lastRowFirstColumn="0" w:lastRowLastColumn="0"/>
-              <w:rPr>
-                <w:rFonts w:cs="Times New Roman"/>
-                <w:color w:val="000000" w:themeColor="text1"/>
-                <w:sz w:val="24"/>
-                <w:szCs w:val="24"/>
-              </w:rPr>
-            </w:pPr>
-            <w:r>
-              <w:rPr>
-                <w:rFonts w:cs="Times New Roman"/>
-                <w:color w:val="000000" w:themeColor="text1"/>
-                <w:sz w:val="24"/>
-                <w:szCs w:val="24"/>
-              </w:rPr>
-              <w:t>0.705361</w:t>
-            </w:r>
-          </w:p>
-        </w:tc>
-        <w:tc>
-          <w:tcPr>
-            <w:tcW w:w="1293" w:type="dxa"/>
-            <w:vAlign w:val="bottom"/>
-          </w:tcPr>
-          <w:p>
-            <w:pPr>
-              <w:ind w:firstLine="0"/>
-              <w:jc w:val="center"/>
-              <w:cnfStyle w:val="000000000000" w:firstRow="0" w:lastRow="0" w:firstColumn="0" w:lastColumn="0" w:oddVBand="0" w:evenVBand="0" w:oddHBand="0" w:evenHBand="0" w:firstRowFirstColumn="0" w:firstRowLastColumn="0" w:lastRowFirstColumn="0" w:lastRowLastColumn="0"/>
-              <w:rPr>
-                <w:rFonts w:cs="Times New Roman"/>
-                <w:color w:val="000000" w:themeColor="text1"/>
-                <w:sz w:val="24"/>
-                <w:szCs w:val="24"/>
-              </w:rPr>
-            </w:pPr>
-            <w:r>
-              <w:rPr>
-                <w:rFonts w:cs="Times New Roman"/>
-                <w:color w:val="000000" w:themeColor="text1"/>
-                <w:sz w:val="24"/>
-                <w:szCs w:val="24"/>
-              </w:rPr>
-              <w:t>Да</w:t>
-            </w:r>
-          </w:p>
-        </w:tc>
-        <w:tc>
-          <w:tcPr>
-            <w:tcW w:w="1267" w:type="dxa"/>
-            <w:vAlign w:val="bottom"/>
-          </w:tcPr>
-          <w:p>
-            <w:pPr>
-              <w:ind w:firstLine="0"/>
-              <w:jc w:val="center"/>
-              <w:cnfStyle w:val="000000000000" w:firstRow="0" w:lastRow="0" w:firstColumn="0" w:lastColumn="0" w:oddVBand="0" w:evenVBand="0" w:oddHBand="0" w:evenHBand="0" w:firstRowFirstColumn="0" w:firstRowLastColumn="0" w:lastRowFirstColumn="0" w:lastRowLastColumn="0"/>
-              <w:rPr>
-                <w:rFonts w:cs="Times New Roman"/>
-                <w:color w:val="000000" w:themeColor="text1"/>
-                <w:sz w:val="24"/>
-                <w:szCs w:val="24"/>
-              </w:rPr>
-            </w:pPr>
-            <w:r>
-              <w:rPr>
-                <w:rFonts w:cs="Times New Roman"/>
-                <w:color w:val="000000" w:themeColor="text1"/>
-                <w:sz w:val="24"/>
-                <w:szCs w:val="24"/>
-              </w:rPr>
-              <w:t>0.447096</w:t>
-            </w:r>
-          </w:p>
-        </w:tc>
-        <w:tc>
-          <w:tcPr>
-            <w:tcW w:w="1292" w:type="dxa"/>
-            <w:vAlign w:val="bottom"/>
-          </w:tcPr>
-          <w:p>
-            <w:pPr>
-              <w:ind w:firstLine="0"/>
-              <w:jc w:val="center"/>
-              <w:cnfStyle w:val="000000000000" w:firstRow="0" w:lastRow="0" w:firstColumn="0" w:lastColumn="0" w:oddVBand="0" w:evenVBand="0" w:oddHBand="0" w:evenHBand="0" w:firstRowFirstColumn="0" w:firstRowLastColumn="0" w:lastRowFirstColumn="0" w:lastRowLastColumn="0"/>
-              <w:rPr>
-                <w:rFonts w:cs="Times New Roman"/>
-                <w:color w:val="000000" w:themeColor="text1"/>
-                <w:sz w:val="24"/>
-                <w:szCs w:val="24"/>
-              </w:rPr>
-            </w:pPr>
-            <w:r>
-              <w:rPr>
-                <w:rFonts w:cs="Times New Roman"/>
-                <w:color w:val="000000" w:themeColor="text1"/>
-                <w:sz w:val="24"/>
-                <w:szCs w:val="24"/>
-              </w:rPr>
-              <w:t>Нет</w:t>
-            </w:r>
-          </w:p>
-        </w:tc>
-      </w:tr>
-      <w:tr>
-        <w:trPr>
-          <w:trHeight w:val="483"/>
-        </w:trPr>
-        <w:tc>
-          <w:tcPr>
-            <w:cnfStyle w:val="001000000000" w:firstRow="0" w:lastRow="0" w:firstColumn="1" w:lastColumn="0" w:oddVBand="0" w:evenVBand="0" w:oddHBand="0" w:evenHBand="0" w:firstRowFirstColumn="0" w:firstRowLastColumn="0" w:lastRowFirstColumn="0" w:lastRowLastColumn="0"/>
-            <w:tcW w:w="1242" w:type="dxa"/>
-            <w:vAlign w:val="bottom"/>
-          </w:tcPr>
-          <w:p>
-            <w:pPr>
-              <w:ind w:firstLine="0"/>
-              <w:jc w:val="center"/>
-              <w:rPr>
-                <w:rFonts w:cs="Times New Roman"/>
-                <w:b w:val="0"/>
-                <w:color w:val="000000" w:themeColor="text1"/>
-                <w:sz w:val="24"/>
-                <w:szCs w:val="24"/>
-              </w:rPr>
-            </w:pPr>
-            <w:r>
-              <w:rPr>
-                <w:rFonts w:cs="Times New Roman"/>
-                <w:b w:val="0"/>
-                <w:color w:val="000000" w:themeColor="text1"/>
-                <w:sz w:val="24"/>
-                <w:szCs w:val="24"/>
-              </w:rPr>
-              <w:t>14</w:t>
-            </w:r>
-          </w:p>
-        </w:tc>
-        <w:tc>
-          <w:tcPr>
-            <w:tcW w:w="1418" w:type="dxa"/>
-            <w:vAlign w:val="bottom"/>
-          </w:tcPr>
-          <w:p>
-            <w:pPr>
-              <w:ind w:firstLine="0"/>
-              <w:jc w:val="center"/>
-              <w:cnfStyle w:val="000000000000" w:firstRow="0" w:lastRow="0" w:firstColumn="0" w:lastColumn="0" w:oddVBand="0" w:evenVBand="0" w:oddHBand="0" w:evenHBand="0" w:firstRowFirstColumn="0" w:firstRowLastColumn="0" w:lastRowFirstColumn="0" w:lastRowLastColumn="0"/>
-              <w:rPr>
-                <w:rFonts w:cs="Times New Roman"/>
-                <w:color w:val="000000" w:themeColor="text1"/>
-                <w:sz w:val="24"/>
-                <w:szCs w:val="24"/>
-              </w:rPr>
-            </w:pPr>
-            <w:r>
-              <w:rPr>
-                <w:rFonts w:cs="Times New Roman"/>
-                <w:color w:val="000000" w:themeColor="text1"/>
-                <w:sz w:val="24"/>
-                <w:szCs w:val="24"/>
-              </w:rPr>
-              <w:t>1</w:t>
-            </w:r>
-          </w:p>
-        </w:tc>
-        <w:tc>
-          <w:tcPr>
-            <w:tcW w:w="1411" w:type="dxa"/>
-            <w:vAlign w:val="bottom"/>
-          </w:tcPr>
-          <w:p>
-            <w:pPr>
-              <w:ind w:firstLine="0"/>
-              <w:jc w:val="center"/>
-              <w:cnfStyle w:val="000000000000" w:firstRow="0" w:lastRow="0" w:firstColumn="0" w:lastColumn="0" w:oddVBand="0" w:evenVBand="0" w:oddHBand="0" w:evenHBand="0" w:firstRowFirstColumn="0" w:firstRowLastColumn="0" w:lastRowFirstColumn="0" w:lastRowLastColumn="0"/>
-              <w:rPr>
-                <w:rFonts w:cs="Times New Roman"/>
-                <w:color w:val="000000" w:themeColor="text1"/>
-                <w:sz w:val="24"/>
-                <w:szCs w:val="24"/>
-              </w:rPr>
-            </w:pPr>
-            <w:r>
-              <w:rPr>
-                <w:rFonts w:cs="Times New Roman"/>
-                <w:color w:val="000000" w:themeColor="text1"/>
-                <w:sz w:val="24"/>
-                <w:szCs w:val="24"/>
-              </w:rPr>
-              <w:t>0.00040</w:t>
-            </w:r>
-          </w:p>
-        </w:tc>
-        <w:tc>
-          <w:tcPr>
-            <w:tcW w:w="1931" w:type="dxa"/>
-            <w:vAlign w:val="bottom"/>
-          </w:tcPr>
-          <w:p>
-            <w:pPr>
-              <w:ind w:firstLine="0"/>
-              <w:jc w:val="center"/>
-              <w:cnfStyle w:val="000000000000" w:firstRow="0" w:lastRow="0" w:firstColumn="0" w:lastColumn="0" w:oddVBand="0" w:evenVBand="0" w:oddHBand="0" w:evenHBand="0" w:firstRowFirstColumn="0" w:firstRowLastColumn="0" w:lastRowFirstColumn="0" w:lastRowLastColumn="0"/>
-              <w:rPr>
-                <w:rFonts w:cs="Times New Roman"/>
-                <w:color w:val="000000" w:themeColor="text1"/>
-                <w:sz w:val="24"/>
-                <w:szCs w:val="24"/>
-              </w:rPr>
-            </w:pPr>
-            <w:r>
-              <w:rPr>
-                <w:rFonts w:cs="Times New Roman"/>
-                <w:color w:val="000000" w:themeColor="text1"/>
-                <w:sz w:val="24"/>
-                <w:szCs w:val="24"/>
-              </w:rPr>
-              <w:t>1.000000</w:t>
-            </w:r>
-          </w:p>
-        </w:tc>
-        <w:tc>
-          <w:tcPr>
-            <w:tcW w:w="1293" w:type="dxa"/>
-            <w:vAlign w:val="bottom"/>
-          </w:tcPr>
-          <w:p>
-            <w:pPr>
-              <w:ind w:firstLine="0"/>
-              <w:jc w:val="center"/>
-              <w:cnfStyle w:val="000000000000" w:firstRow="0" w:lastRow="0" w:firstColumn="0" w:lastColumn="0" w:oddVBand="0" w:evenVBand="0" w:oddHBand="0" w:evenHBand="0" w:firstRowFirstColumn="0" w:firstRowLastColumn="0" w:lastRowFirstColumn="0" w:lastRowLastColumn="0"/>
-              <w:rPr>
-                <w:rFonts w:cs="Times New Roman"/>
-                <w:color w:val="000000" w:themeColor="text1"/>
-                <w:sz w:val="24"/>
-                <w:szCs w:val="24"/>
-              </w:rPr>
-            </w:pPr>
-            <w:r>
-              <w:rPr>
-                <w:rFonts w:cs="Times New Roman"/>
-                <w:color w:val="000000" w:themeColor="text1"/>
-                <w:sz w:val="24"/>
-                <w:szCs w:val="24"/>
-              </w:rPr>
-              <w:t>Да</w:t>
-            </w:r>
-          </w:p>
-        </w:tc>
-        <w:tc>
-          <w:tcPr>
-            <w:tcW w:w="1267" w:type="dxa"/>
-            <w:vAlign w:val="bottom"/>
-          </w:tcPr>
-          <w:p>
-            <w:pPr>
-              <w:ind w:firstLine="0"/>
-              <w:jc w:val="center"/>
-              <w:cnfStyle w:val="000000000000" w:firstRow="0" w:lastRow="0" w:firstColumn="0" w:lastColumn="0" w:oddVBand="0" w:evenVBand="0" w:oddHBand="0" w:evenHBand="0" w:firstRowFirstColumn="0" w:firstRowLastColumn="0" w:lastRowFirstColumn="0" w:lastRowLastColumn="0"/>
-              <w:rPr>
-                <w:rFonts w:cs="Times New Roman"/>
-                <w:color w:val="000000" w:themeColor="text1"/>
-                <w:sz w:val="24"/>
-                <w:szCs w:val="24"/>
-              </w:rPr>
-            </w:pPr>
-            <w:r>
-              <w:rPr>
-                <w:rFonts w:cs="Times New Roman"/>
-                <w:color w:val="000000" w:themeColor="text1"/>
-                <w:sz w:val="24"/>
-                <w:szCs w:val="24"/>
-              </w:rPr>
-              <w:t>1.000000</w:t>
-            </w:r>
-          </w:p>
-        </w:tc>
-        <w:tc>
-          <w:tcPr>
-            <w:tcW w:w="1292" w:type="dxa"/>
-            <w:vAlign w:val="bottom"/>
-          </w:tcPr>
-          <w:p>
-            <w:pPr>
-              <w:ind w:firstLine="0"/>
-              <w:jc w:val="center"/>
-              <w:cnfStyle w:val="000000000000" w:firstRow="0" w:lastRow="0" w:firstColumn="0" w:lastColumn="0" w:oddVBand="0" w:evenVBand="0" w:oddHBand="0" w:evenHBand="0" w:firstRowFirstColumn="0" w:firstRowLastColumn="0" w:lastRowFirstColumn="0" w:lastRowLastColumn="0"/>
-              <w:rPr>
-                <w:rFonts w:cs="Times New Roman"/>
-                <w:color w:val="000000" w:themeColor="text1"/>
-                <w:sz w:val="24"/>
-                <w:szCs w:val="24"/>
-              </w:rPr>
-            </w:pPr>
-            <w:r>
-              <w:rPr>
-                <w:rFonts w:cs="Times New Roman"/>
-                <w:color w:val="000000" w:themeColor="text1"/>
-                <w:sz w:val="24"/>
-                <w:szCs w:val="24"/>
-              </w:rPr>
-              <w:t>Да</w:t>
-            </w:r>
-          </w:p>
-        </w:tc>
-      </w:tr>
-      <w:tr>
-        <w:trPr>
-          <w:trHeight w:val="483"/>
-        </w:trPr>
-        <w:tc>
-          <w:tcPr>
-            <w:cnfStyle w:val="001000000000" w:firstRow="0" w:lastRow="0" w:firstColumn="1" w:lastColumn="0" w:oddVBand="0" w:evenVBand="0" w:oddHBand="0" w:evenHBand="0" w:firstRowFirstColumn="0" w:firstRowLastColumn="0" w:lastRowFirstColumn="0" w:lastRowLastColumn="0"/>
-            <w:tcW w:w="1242" w:type="dxa"/>
-            <w:vAlign w:val="bottom"/>
-          </w:tcPr>
-          <w:p>
-            <w:pPr>
-              <w:ind w:firstLine="0"/>
-              <w:jc w:val="center"/>
-              <w:rPr>
-                <w:rFonts w:cs="Times New Roman"/>
-                <w:b w:val="0"/>
-                <w:color w:val="000000" w:themeColor="text1"/>
-                <w:sz w:val="24"/>
-                <w:szCs w:val="24"/>
-              </w:rPr>
-            </w:pPr>
-            <w:r>
-              <w:rPr>
-                <w:rFonts w:cs="Times New Roman"/>
-                <w:b w:val="0"/>
-                <w:color w:val="000000" w:themeColor="text1"/>
-                <w:sz w:val="24"/>
-                <w:szCs w:val="24"/>
-              </w:rPr>
-              <w:t>14</w:t>
-            </w:r>
-          </w:p>
-        </w:tc>
-        <w:tc>
-          <w:tcPr>
-            <w:tcW w:w="1418" w:type="dxa"/>
-            <w:vAlign w:val="bottom"/>
-          </w:tcPr>
-          <w:p>
-            <w:pPr>
-              <w:ind w:firstLine="0"/>
-              <w:jc w:val="center"/>
-              <w:cnfStyle w:val="000000000000" w:firstRow="0" w:lastRow="0" w:firstColumn="0" w:lastColumn="0" w:oddVBand="0" w:evenVBand="0" w:oddHBand="0" w:evenHBand="0" w:firstRowFirstColumn="0" w:firstRowLastColumn="0" w:lastRowFirstColumn="0" w:lastRowLastColumn="0"/>
-              <w:rPr>
-                <w:rFonts w:cs="Times New Roman"/>
-                <w:color w:val="000000" w:themeColor="text1"/>
-                <w:sz w:val="24"/>
-                <w:szCs w:val="24"/>
-              </w:rPr>
-            </w:pPr>
-            <w:r>
-              <w:rPr>
-                <w:rFonts w:cs="Times New Roman"/>
-                <w:color w:val="000000" w:themeColor="text1"/>
-                <w:sz w:val="24"/>
-                <w:szCs w:val="24"/>
-              </w:rPr>
-              <w:t>2</w:t>
-            </w:r>
-          </w:p>
-        </w:tc>
-        <w:tc>
-          <w:tcPr>
-            <w:tcW w:w="1411" w:type="dxa"/>
-            <w:vAlign w:val="bottom"/>
-          </w:tcPr>
-          <w:p>
-            <w:pPr>
-              <w:ind w:firstLine="0"/>
-              <w:jc w:val="center"/>
-              <w:cnfStyle w:val="000000000000" w:firstRow="0" w:lastRow="0" w:firstColumn="0" w:lastColumn="0" w:oddVBand="0" w:evenVBand="0" w:oddHBand="0" w:evenHBand="0" w:firstRowFirstColumn="0" w:firstRowLastColumn="0" w:lastRowFirstColumn="0" w:lastRowLastColumn="0"/>
-              <w:rPr>
-                <w:rFonts w:cs="Times New Roman"/>
-                <w:color w:val="000000" w:themeColor="text1"/>
-                <w:sz w:val="24"/>
-                <w:szCs w:val="24"/>
-              </w:rPr>
-            </w:pPr>
-            <w:r>
-              <w:rPr>
-                <w:rFonts w:cs="Times New Roman"/>
-                <w:color w:val="000000" w:themeColor="text1"/>
-                <w:sz w:val="24"/>
-                <w:szCs w:val="24"/>
-              </w:rPr>
-              <w:t>0.00068</w:t>
-            </w:r>
-          </w:p>
-        </w:tc>
-        <w:tc>
-          <w:tcPr>
-            <w:tcW w:w="1931" w:type="dxa"/>
-            <w:vAlign w:val="bottom"/>
-          </w:tcPr>
-          <w:p>
-            <w:pPr>
-              <w:ind w:firstLine="0"/>
-              <w:jc w:val="center"/>
-              <w:cnfStyle w:val="000000000000" w:firstRow="0" w:lastRow="0" w:firstColumn="0" w:lastColumn="0" w:oddVBand="0" w:evenVBand="0" w:oddHBand="0" w:evenHBand="0" w:firstRowFirstColumn="0" w:firstRowLastColumn="0" w:lastRowFirstColumn="0" w:lastRowLastColumn="0"/>
-              <w:rPr>
-                <w:rFonts w:cs="Times New Roman"/>
-                <w:color w:val="000000" w:themeColor="text1"/>
-                <w:sz w:val="24"/>
-                <w:szCs w:val="24"/>
-              </w:rPr>
-            </w:pPr>
-            <w:r>
-              <w:rPr>
-                <w:rFonts w:cs="Times New Roman"/>
-                <w:color w:val="000000" w:themeColor="text1"/>
-                <w:sz w:val="24"/>
-                <w:szCs w:val="24"/>
-              </w:rPr>
-              <w:t>0.610009</w:t>
-            </w:r>
-          </w:p>
-        </w:tc>
-        <w:tc>
-          <w:tcPr>
-            <w:tcW w:w="1293" w:type="dxa"/>
-            <w:vAlign w:val="bottom"/>
-          </w:tcPr>
-          <w:p>
-            <w:pPr>
-              <w:ind w:firstLine="0"/>
-              <w:jc w:val="center"/>
-              <w:cnfStyle w:val="000000000000" w:firstRow="0" w:lastRow="0" w:firstColumn="0" w:lastColumn="0" w:oddVBand="0" w:evenVBand="0" w:oddHBand="0" w:evenHBand="0" w:firstRowFirstColumn="0" w:firstRowLastColumn="0" w:lastRowFirstColumn="0" w:lastRowLastColumn="0"/>
-              <w:rPr>
-                <w:rFonts w:cs="Times New Roman"/>
-                <w:color w:val="000000" w:themeColor="text1"/>
-                <w:sz w:val="24"/>
-                <w:szCs w:val="24"/>
-              </w:rPr>
-            </w:pPr>
-            <w:r>
-              <w:rPr>
-                <w:rFonts w:cs="Times New Roman"/>
-                <w:color w:val="000000" w:themeColor="text1"/>
-                <w:sz w:val="24"/>
-                <w:szCs w:val="24"/>
-              </w:rPr>
-              <w:t>Д</w:t>
-            </w:r>
-            <w:r>
-              <w:rPr>
-                <w:rFonts w:cs="Times New Roman"/>
-                <w:color w:val="000000" w:themeColor="text1"/>
-                <w:sz w:val="24"/>
-                <w:szCs w:val="24"/>
-              </w:rPr>
-              <w:t>а</w:t>
-            </w:r>
-          </w:p>
-        </w:tc>
-        <w:tc>
-          <w:tcPr>
-            <w:tcW w:w="1267" w:type="dxa"/>
-            <w:vAlign w:val="bottom"/>
-          </w:tcPr>
-          <w:p>
-            <w:pPr>
-              <w:ind w:firstLine="0"/>
-              <w:jc w:val="center"/>
-              <w:cnfStyle w:val="000000000000" w:firstRow="0" w:lastRow="0" w:firstColumn="0" w:lastColumn="0" w:oddVBand="0" w:evenVBand="0" w:oddHBand="0" w:evenHBand="0" w:firstRowFirstColumn="0" w:firstRowLastColumn="0" w:lastRowFirstColumn="0" w:lastRowLastColumn="0"/>
-              <w:rPr>
-                <w:rFonts w:cs="Times New Roman"/>
-                <w:color w:val="000000" w:themeColor="text1"/>
-                <w:sz w:val="24"/>
-                <w:szCs w:val="24"/>
-              </w:rPr>
-            </w:pPr>
-            <w:r>
-              <w:rPr>
-                <w:rFonts w:cs="Times New Roman"/>
-                <w:color w:val="000000" w:themeColor="text1"/>
-                <w:sz w:val="24"/>
-                <w:szCs w:val="24"/>
-              </w:rPr>
-              <w:t>0.683907</w:t>
-            </w:r>
-          </w:p>
-        </w:tc>
-        <w:tc>
-          <w:tcPr>
-            <w:tcW w:w="1292" w:type="dxa"/>
-            <w:vAlign w:val="bottom"/>
-          </w:tcPr>
-          <w:p>
-            <w:pPr>
-              <w:ind w:firstLine="0"/>
-              <w:jc w:val="center"/>
-              <w:cnfStyle w:val="000000000000" w:firstRow="0" w:lastRow="0" w:firstColumn="0" w:lastColumn="0" w:oddVBand="0" w:evenVBand="0" w:oddHBand="0" w:evenHBand="0" w:firstRowFirstColumn="0" w:firstRowLastColumn="0" w:lastRowFirstColumn="0" w:lastRowLastColumn="0"/>
-              <w:rPr>
-                <w:rFonts w:cs="Times New Roman"/>
-                <w:color w:val="000000" w:themeColor="text1"/>
-                <w:sz w:val="24"/>
-                <w:szCs w:val="24"/>
-              </w:rPr>
-            </w:pPr>
-            <w:r>
-              <w:rPr>
-                <w:rFonts w:cs="Times New Roman"/>
-                <w:color w:val="000000" w:themeColor="text1"/>
-                <w:sz w:val="24"/>
-                <w:szCs w:val="24"/>
-              </w:rPr>
-              <w:t>Да</w:t>
-            </w:r>
-          </w:p>
-        </w:tc>
-      </w:tr>
-    </w:tbl>
-    <w:p>
-      <w:pPr>
-        <w:rPr>
-          <w:lang w:val="en-US"/>
-        </w:rPr>
-      </w:pPr>
+        <w:t xml:space="preserve">3.3 </w:t>
+      </w:r>
+      <w:r>
+        <w:t>Имитационное моделирование и статистический анализ эффективности последовательностей Шапиро</w:t>
+      </w:r>
       <w:bookmarkStart w:id="14" w:name="_GoBack"/>
       <w:bookmarkEnd w:id="14"/>
     </w:p>
-    <w:p>
-      <w:r>
-        <w:t xml:space="preserve">В сценарии с малым расстоянием между целями (Δ = 4) обе последовательности успешно обнаружили оба сигнала. Это объясняется тем, </w:t>
-      </w:r>
-      <w:r>
-        <w:lastRenderedPageBreak/>
-        <w:t xml:space="preserve">что пики ещё достаточно разделены, и даже случайная последовательность не </w:t>
-      </w:r>
-      <w:r>
-        <w:t>создаёт существенных искажений.</w:t>
-      </w:r>
-    </w:p>
-    <w:p>
-      <w:r>
-        <w:t>При Δ = 8 видно преимущество последовательности Шапиро: вторая цель обнаружена, тогда как при использовании случайной последовательности — нет. Это связано с тем, что боковые лепестки случайной последовательности част</w:t>
-      </w:r>
-      <w:r>
-        <w:t>ично перекрывают слабый сигнал.</w:t>
-      </w:r>
-    </w:p>
-    <w:p>
-      <w:r>
-        <w:t>При Δ = 14 обе последовательности справляются с задачей, но при этом у последовательности Шапиро амплитуды более стабильные и б</w:t>
-      </w:r>
-      <w:r>
-        <w:t>оковые эффекты выражены меньше.</w:t>
-      </w:r>
-    </w:p>
-    <w:p>
-      <w:r>
-        <w:t xml:space="preserve">Результаты </w:t>
-      </w:r>
-      <w:r>
-        <w:t>эксперимента показывают, что использование последовательностей Шапиро в качестве модулирующего импульса позволяет достичь более стабильной корреляционной структуры принимаемого сигнала по сравнению со случайными бинарными последовательностями той же длины. Это выражается в меньшей вариативности боковых лепестков автокорреляционной функции и более отчётливом выделении основного пика при корреляционной обработке. В условиях шумовых искажений такая особенность способствует повышению достоверности обнаружения слабых отражений, особенно при малом временном разнесении целей.</w:t>
-      </w:r>
+    <w:p/>
+    <w:p>
       <w:r>
         <w:br w:type="page"/>
       </w:r>
@@ -19803,6 +18146,7 @@
         <w:docPartUnique/>
       </w:docPartObj>
     </w:sdtPr>
+    <w:sdtEndPr/>
     <w:sdtContent>
       <w:p>
         <w:pPr>
@@ -19822,7 +18166,7 @@
           <w:rPr>
             <w:noProof/>
           </w:rPr>
-          <w:t>17</w:t>
+          <w:t>15</w:t>
         </w:r>
         <w:r>
           <w:fldChar w:fldCharType="end"/>
@@ -20695,6 +19039,7 @@
   <w:style w:type="character" w:default="1" w:styleId="a0">
     <w:name w:val="Default Paragraph Font"/>
     <w:uiPriority w:val="1"/>
+    <w:semiHidden/>
     <w:unhideWhenUsed/>
   </w:style>
   <w:style w:type="table" w:default="1" w:styleId="a1">
@@ -21529,6 +19874,7 @@
   <w:style w:type="character" w:default="1" w:styleId="a0">
     <w:name w:val="Default Paragraph Font"/>
     <w:uiPriority w:val="1"/>
+    <w:semiHidden/>
     <w:unhideWhenUsed/>
   </w:style>
   <w:style w:type="table" w:default="1" w:styleId="a1">
@@ -22142,522 +20488,6 @@
 </w:styles>
 </file>
 
-<file path=word/glossary/document.xml><?xml version="1.0" encoding="utf-8"?>
-<w:glossaryDocument xmlns:wpc="http://schemas.microsoft.com/office/word/2010/wordprocessingCanvas" xmlns:mc="http://schemas.openxmlformats.org/markup-compatibility/2006" xmlns:o="urn:schemas-microsoft-com:office:office" xmlns:r="http://schemas.openxmlformats.org/officeDocument/2006/relationships" xmlns:m="http://schemas.openxmlformats.org/officeDocument/2006/math" xmlns:v="urn:schemas-microsoft-com:vml" xmlns:wp14="http://schemas.microsoft.com/office/word/2010/wordprocessingDrawing" xmlns:wp="http://schemas.openxmlformats.org/drawingml/2006/wordprocessingDrawing" xmlns:w10="urn:schemas-microsoft-com:office:word" xmlns:w="http://schemas.openxmlformats.org/wordprocessingml/2006/main" xmlns:w14="http://schemas.microsoft.com/office/word/2010/wordml" xmlns:wpg="http://schemas.microsoft.com/office/word/2010/wordprocessingGroup" xmlns:wpi="http://schemas.microsoft.com/office/word/2010/wordprocessingInk" xmlns:wne="http://schemas.microsoft.com/office/word/2006/wordml" xmlns:wps="http://schemas.microsoft.com/office/word/2010/wordprocessingShape" mc:Ignorable="w14 wp14"/>
-</file>
-
-<file path=word/glossary/fontTable.xml><?xml version="1.0" encoding="utf-8"?>
-<w:fonts xmlns:mc="http://schemas.openxmlformats.org/markup-compatibility/2006" xmlns:r="http://schemas.openxmlformats.org/officeDocument/2006/relationships" xmlns:w="http://schemas.openxmlformats.org/wordprocessingml/2006/main" xmlns:w14="http://schemas.microsoft.com/office/word/2010/wordml" mc:Ignorable="w14">
-  <w:font w:name="Times New Roman">
-    <w:panose1 w:val="02020603050405020304"/>
-    <w:charset w:val="CC"/>
-    <w:family w:val="roman"/>
-    <w:pitch w:val="variable"/>
-    <w:sig w:usb0="E0002EFF" w:usb1="C000785B" w:usb2="00000009" w:usb3="00000000" w:csb0="000001FF" w:csb1="00000000"/>
-  </w:font>
-  <w:font w:name="Symbol">
-    <w:panose1 w:val="05050102010706020507"/>
-    <w:charset w:val="02"/>
-    <w:family w:val="roman"/>
-    <w:pitch w:val="variable"/>
-    <w:sig w:usb0="00000000" w:usb1="10000000" w:usb2="00000000" w:usb3="00000000" w:csb0="80000000" w:csb1="00000000"/>
-  </w:font>
-  <w:font w:name="Courier New">
-    <w:panose1 w:val="02070309020205020404"/>
-    <w:charset w:val="CC"/>
-    <w:family w:val="modern"/>
-    <w:pitch w:val="fixed"/>
-    <w:sig w:usb0="E0002EFF" w:usb1="C0007843" w:usb2="00000009" w:usb3="00000000" w:csb0="000001FF" w:csb1="00000000"/>
-  </w:font>
-  <w:font w:name="Wingdings">
-    <w:panose1 w:val="05000000000000000000"/>
-    <w:charset w:val="02"/>
-    <w:family w:val="auto"/>
-    <w:pitch w:val="variable"/>
-    <w:sig w:usb0="00000000" w:usb1="10000000" w:usb2="00000000" w:usb3="00000000" w:csb0="80000000" w:csb1="00000000"/>
-  </w:font>
-  <w:font w:name="Calibri">
-    <w:panose1 w:val="020F0502020204030204"/>
-    <w:charset w:val="CC"/>
-    <w:family w:val="swiss"/>
-    <w:pitch w:val="variable"/>
-    <w:sig w:usb0="E4002EFF" w:usb1="C200247B" w:usb2="00000009" w:usb3="00000000" w:csb0="000001FF" w:csb1="00000000"/>
-  </w:font>
-  <w:font w:name="Tahoma">
-    <w:panose1 w:val="020B0604030504040204"/>
-    <w:charset w:val="CC"/>
-    <w:family w:val="swiss"/>
-    <w:pitch w:val="variable"/>
-    <w:sig w:usb0="E1002EFF" w:usb1="C000605B" w:usb2="00000029" w:usb3="00000000" w:csb0="000101FF" w:csb1="00000000"/>
-  </w:font>
-  <w:font w:name="Cambria">
-    <w:panose1 w:val="02040503050406030204"/>
-    <w:charset w:val="CC"/>
-    <w:family w:val="roman"/>
-    <w:pitch w:val="variable"/>
-    <w:sig w:usb0="E00006FF" w:usb1="420024FF" w:usb2="02000000" w:usb3="00000000" w:csb0="0000019F" w:csb1="00000000"/>
-  </w:font>
-  <w:font w:name="Consolas">
-    <w:panose1 w:val="020B0609020204030204"/>
-    <w:charset w:val="CC"/>
-    <w:family w:val="modern"/>
-    <w:pitch w:val="fixed"/>
-    <w:sig w:usb0="E00006FF" w:usb1="0000FCFF" w:usb2="00000001" w:usb3="00000000" w:csb0="0000019F" w:csb1="00000000"/>
-  </w:font>
-  <w:font w:name="Cambria Math">
-    <w:panose1 w:val="02040503050406030204"/>
-    <w:charset w:val="CC"/>
-    <w:family w:val="roman"/>
-    <w:pitch w:val="variable"/>
-    <w:sig w:usb0="E00006FF" w:usb1="420024FF" w:usb2="02000000" w:usb3="00000000" w:csb0="0000019F" w:csb1="00000000"/>
-  </w:font>
-</w:fonts>
-</file>
-
-<file path=word/glossary/settings.xml><?xml version="1.0" encoding="utf-8"?>
-<w:settings xmlns:mc="http://schemas.openxmlformats.org/markup-compatibility/2006" xmlns:o="urn:schemas-microsoft-com:office:office" xmlns:r="http://schemas.openxmlformats.org/officeDocument/2006/relationships" xmlns:m="http://schemas.openxmlformats.org/officeDocument/2006/math" xmlns:v="urn:schemas-microsoft-com:vml" xmlns:w10="urn:schemas-microsoft-com:office:word" xmlns:w="http://schemas.openxmlformats.org/wordprocessingml/2006/main" xmlns:w14="http://schemas.microsoft.com/office/word/2010/wordml" xmlns:sl="http://schemas.openxmlformats.org/schemaLibrary/2006/main" mc:Ignorable="w14">
-  <w:view w:val="normal"/>
-  <w:defaultTabStop w:val="708"/>
-  <w:characterSpacingControl w:val="doNotCompress"/>
-  <w:compat>
-    <w:useFELayout/>
-    <w:compatSetting w:name="compatibilityMode" w:uri="http://schemas.microsoft.com/office/word" w:val="14"/>
-    <w:compatSetting w:name="overrideTableStyleFontSizeAndJustification" w:uri="http://schemas.microsoft.com/office/word" w:val="1"/>
-    <w:compatSetting w:name="enableOpenTypeFeatures" w:uri="http://schemas.microsoft.com/office/word" w:val="1"/>
-    <w:compatSetting w:name="doNotFlipMirrorIndents" w:uri="http://schemas.microsoft.com/office/word" w:val="1"/>
-  </w:compat>
-  <w:rsids>
-    <w:rsidRoot w:val="00B857DA"/>
-    <w:rsid w:val="00B857DA"/>
-    <w:rsid w:val="00EC53AF"/>
-  </w:rsids>
-  <m:mathPr>
-    <m:mathFont m:val="Cambria Math"/>
-    <m:brkBin m:val="before"/>
-    <m:brkBinSub m:val="--"/>
-    <m:smallFrac m:val="0"/>
-    <m:dispDef/>
-    <m:lMargin m:val="0"/>
-    <m:rMargin m:val="0"/>
-    <m:defJc m:val="centerGroup"/>
-    <m:wrapIndent m:val="1440"/>
-    <m:intLim m:val="subSup"/>
-    <m:naryLim m:val="undOvr"/>
-  </m:mathPr>
-  <w:themeFontLang w:val="ru-RU"/>
-  <w:clrSchemeMapping w:bg1="light1" w:t1="dark1" w:bg2="light2" w:t2="dark2" w:accent1="accent1" w:accent2="accent2" w:accent3="accent3" w:accent4="accent4" w:accent5="accent5" w:accent6="accent6" w:hyperlink="hyperlink" w:followedHyperlink="followedHyperlink"/>
-  <w:decimalSymbol w:val=","/>
-  <w:listSeparator w:val=";"/>
-</w:settings>
-</file>
-
-<file path=word/glossary/styles.xml><?xml version="1.0" encoding="utf-8"?>
-<w:styles xmlns:mc="http://schemas.openxmlformats.org/markup-compatibility/2006" xmlns:r="http://schemas.openxmlformats.org/officeDocument/2006/relationships" xmlns:w="http://schemas.openxmlformats.org/wordprocessingml/2006/main" xmlns:w14="http://schemas.microsoft.com/office/word/2010/wordml" mc:Ignorable="w14">
-  <w:docDefaults>
-    <w:rPrDefault>
-      <w:rPr>
-        <w:rFonts w:asciiTheme="minorHAnsi" w:eastAsiaTheme="minorEastAsia" w:hAnsiTheme="minorHAnsi" w:cstheme="minorBidi"/>
-        <w:sz w:val="22"/>
-        <w:szCs w:val="22"/>
-        <w:lang w:val="ru-RU" w:eastAsia="ru-RU" w:bidi="ar-SA"/>
-      </w:rPr>
-    </w:rPrDefault>
-    <w:pPrDefault>
-      <w:pPr>
-        <w:spacing w:after="200" w:line="276" w:lineRule="auto"/>
-      </w:pPr>
-    </w:pPrDefault>
-  </w:docDefaults>
-  <w:latentStyles w:defLockedState="0" w:defUIPriority="99" w:defSemiHidden="1" w:defUnhideWhenUsed="1" w:defQFormat="0" w:count="267">
-    <w:lsdException w:name="Normal" w:semiHidden="0" w:uiPriority="0" w:unhideWhenUsed="0" w:qFormat="1"/>
-    <w:lsdException w:name="heading 1" w:semiHidden="0" w:uiPriority="9" w:unhideWhenUsed="0" w:qFormat="1"/>
-    <w:lsdException w:name="heading 2" w:uiPriority="9" w:qFormat="1"/>
-    <w:lsdException w:name="heading 3" w:uiPriority="9" w:qFormat="1"/>
-    <w:lsdException w:name="heading 4" w:uiPriority="9" w:qFormat="1"/>
-    <w:lsdException w:name="heading 5" w:uiPriority="9" w:qFormat="1"/>
-    <w:lsdException w:name="heading 6" w:uiPriority="9" w:qFormat="1"/>
-    <w:lsdException w:name="heading 7" w:uiPriority="9" w:qFormat="1"/>
-    <w:lsdException w:name="heading 8" w:uiPriority="9" w:qFormat="1"/>
-    <w:lsdException w:name="heading 9" w:uiPriority="9" w:qFormat="1"/>
-    <w:lsdException w:name="toc 1" w:uiPriority="39"/>
-    <w:lsdException w:name="toc 2" w:uiPriority="39"/>
-    <w:lsdException w:name="toc 3" w:uiPriority="39"/>
-    <w:lsdException w:name="toc 4" w:uiPriority="39"/>
-    <w:lsdException w:name="toc 5" w:uiPriority="39"/>
-    <w:lsdException w:name="toc 6" w:uiPriority="39"/>
-    <w:lsdException w:name="toc 7" w:uiPriority="39"/>
-    <w:lsdException w:name="toc 8" w:uiPriority="39"/>
-    <w:lsdException w:name="toc 9" w:uiPriority="39"/>
-    <w:lsdException w:name="caption" w:uiPriority="35" w:qFormat="1"/>
-    <w:lsdException w:name="Title" w:semiHidden="0" w:uiPriority="10" w:unhideWhenUsed="0" w:qFormat="1"/>
-    <w:lsdException w:name="Default Paragraph Font" w:uiPriority="1"/>
-    <w:lsdException w:name="Subtitle" w:semiHidden="0" w:uiPriority="11" w:unhideWhenUsed="0" w:qFormat="1"/>
-    <w:lsdException w:name="Strong" w:semiHidden="0" w:uiPriority="22" w:unhideWhenUsed="0" w:qFormat="1"/>
-    <w:lsdException w:name="Emphasis" w:semiHidden="0" w:uiPriority="20" w:unhideWhenUsed="0" w:qFormat="1"/>
-    <w:lsdException w:name="Table Grid" w:semiHidden="0" w:uiPriority="59" w:unhideWhenUsed="0"/>
-    <w:lsdException w:name="Placeholder Text" w:unhideWhenUsed="0"/>
-    <w:lsdException w:name="No Spacing" w:semiHidden="0" w:uiPriority="1" w:unhideWhenUsed="0" w:qFormat="1"/>
-    <w:lsdException w:name="Light Shading" w:semiHidden="0" w:uiPriority="60" w:unhideWhenUsed="0"/>
-    <w:lsdException w:name="Light List" w:semiHidden="0" w:uiPriority="61" w:unhideWhenUsed="0"/>
-    <w:lsdException w:name="Light Grid" w:semiHidden="0" w:uiPriority="62" w:unhideWhenUsed="0"/>
-    <w:lsdException w:name="Medium Shading 1" w:semiHidden="0" w:uiPriority="63" w:unhideWhenUsed="0"/>
-    <w:lsdException w:name="Medium Shading 2" w:semiHidden="0" w:uiPriority="64" w:unhideWhenUsed="0"/>
-    <w:lsdException w:name="Medium List 1" w:semiHidden="0" w:uiPriority="65" w:unhideWhenUsed="0"/>
-    <w:lsdException w:name="Medium List 2" w:semiHidden="0" w:uiPriority="66" w:unhideWhenUsed="0"/>
-    <w:lsdException w:name="Medium Grid 1" w:semiHidden="0" w:uiPriority="67" w:unhideWhenUsed="0"/>
-    <w:lsdException w:name="Medium Grid 2" w:semiHidden="0" w:uiPriority="68" w:unhideWhenUsed="0"/>
-    <w:lsdException w:name="Medium Grid 3" w:semiHidden="0" w:uiPriority="69" w:unhideWhenUsed="0"/>
-    <w:lsdException w:name="Dark List" w:semiHidden="0" w:uiPriority="70" w:unhideWhenUsed="0"/>
-    <w:lsdException w:name="Colorful Shading" w:semiHidden="0" w:uiPriority="71" w:unhideWhenUsed="0"/>
-    <w:lsdException w:name="Colorful List" w:semiHidden="0" w:uiPriority="72" w:unhideWhenUsed="0"/>
-    <w:lsdException w:name="Colorful Grid" w:semiHidden="0" w:uiPriority="73" w:unhideWhenUsed="0"/>
-    <w:lsdException w:name="Light Shading Accent 1" w:semiHidden="0" w:uiPriority="60" w:unhideWhenUsed="0"/>
-    <w:lsdException w:name="Light List Accent 1" w:semiHidden="0" w:uiPriority="61" w:unhideWhenUsed="0"/>
-    <w:lsdException w:name="Light Grid Accent 1" w:semiHidden="0" w:uiPriority="62" w:unhideWhenUsed="0"/>
-    <w:lsdException w:name="Medium Shading 1 Accent 1" w:semiHidden="0" w:uiPriority="63" w:unhideWhenUsed="0"/>
-    <w:lsdException w:name="Medium Shading 2 Accent 1" w:semiHidden="0" w:uiPriority="64" w:unhideWhenUsed="0"/>
-    <w:lsdException w:name="Medium List 1 Accent 1" w:semiHidden="0" w:uiPriority="65" w:unhideWhenUsed="0"/>
-    <w:lsdException w:name="Revision" w:unhideWhenUsed="0"/>
-    <w:lsdException w:name="List Paragraph" w:semiHidden="0" w:uiPriority="34" w:unhideWhenUsed="0" w:qFormat="1"/>
-    <w:lsdException w:name="Quote" w:semiHidden="0" w:uiPriority="29" w:unhideWhenUsed="0" w:qFormat="1"/>
-    <w:lsdException w:name="Intense Quote" w:semiHidden="0" w:uiPriority="30" w:unhideWhenUsed="0" w:qFormat="1"/>
-    <w:lsdException w:name="Medium List 2 Accent 1" w:semiHidden="0" w:uiPriority="66" w:unhideWhenUsed="0"/>
-    <w:lsdException w:name="Medium Grid 1 Accent 1" w:semiHidden="0" w:uiPriority="67" w:unhideWhenUsed="0"/>
-    <w:lsdException w:name="Medium Grid 2 Accent 1" w:semiHidden="0" w:uiPriority="68" w:unhideWhenUsed="0"/>
-    <w:lsdException w:name="Medium Grid 3 Accent 1" w:semiHidden="0" w:uiPriority="69" w:unhideWhenUsed="0"/>
-    <w:lsdException w:name="Dark List Accent 1" w:semiHidden="0" w:uiPriority="70" w:unhideWhenUsed="0"/>
-    <w:lsdException w:name="Colorful Shading Accent 1" w:semiHidden="0" w:uiPriority="71" w:unhideWhenUsed="0"/>
-    <w:lsdException w:name="Colorful List Accent 1" w:semiHidden="0" w:uiPriority="72" w:unhideWhenUsed="0"/>
-    <w:lsdException w:name="Colorful Grid Accent 1" w:semiHidden="0" w:uiPriority="73" w:unhideWhenUsed="0"/>
-    <w:lsdException w:name="Light Shading Accent 2" w:semiHidden="0" w:uiPriority="60" w:unhideWhenUsed="0"/>
-    <w:lsdException w:name="Light List Accent 2" w:semiHidden="0" w:uiPriority="61" w:unhideWhenUsed="0"/>
-    <w:lsdException w:name="Light Grid Accent 2" w:semiHidden="0" w:uiPriority="62" w:unhideWhenUsed="0"/>
-    <w:lsdException w:name="Medium Shading 1 Accent 2" w:semiHidden="0" w:uiPriority="63" w:unhideWhenUsed="0"/>
-    <w:lsdException w:name="Medium Shading 2 Accent 2" w:semiHidden="0" w:uiPriority="64" w:unhideWhenUsed="0"/>
-    <w:lsdException w:name="Medium List 1 Accent 2" w:semiHidden="0" w:uiPriority="65" w:unhideWhenUsed="0"/>
-    <w:lsdException w:name="Medium List 2 Accent 2" w:semiHidden="0" w:uiPriority="66" w:unhideWhenUsed="0"/>
-    <w:lsdException w:name="Medium Grid 1 Accent 2" w:semiHidden="0" w:uiPriority="67" w:unhideWhenUsed="0"/>
-    <w:lsdException w:name="Medium Grid 2 Accent 2" w:semiHidden="0" w:uiPriority="68" w:unhideWhenUsed="0"/>
-    <w:lsdException w:name="Medium Grid 3 Accent 2" w:semiHidden="0" w:uiPriority="69" w:unhideWhenUsed="0"/>
-    <w:lsdException w:name="Dark List Accent 2" w:semiHidden="0" w:uiPriority="70" w:unhideWhenUsed="0"/>
-    <w:lsdException w:name="Colorful Shading Accent 2" w:semiHidden="0" w:uiPriority="71" w:unhideWhenUsed="0"/>
-    <w:lsdException w:name="Colorful List Accent 2" w:semiHidden="0" w:uiPriority="72" w:unhideWhenUsed="0"/>
-    <w:lsdException w:name="Colorful Grid Accent 2" w:semiHidden="0" w:uiPriority="73" w:unhideWhenUsed="0"/>
-    <w:lsdException w:name="Light Shading Accent 3" w:semiHidden="0" w:uiPriority="60" w:unhideWhenUsed="0"/>
-    <w:lsdException w:name="Light List Accent 3" w:semiHidden="0" w:uiPriority="61" w:unhideWhenUsed="0"/>
-    <w:lsdException w:name="Light Grid Accent 3" w:semiHidden="0" w:uiPriority="62" w:unhideWhenUsed="0"/>
-    <w:lsdException w:name="Medium Shading 1 Accent 3" w:semiHidden="0" w:uiPriority="63" w:unhideWhenUsed="0"/>
-    <w:lsdException w:name="Medium Shading 2 Accent 3" w:semiHidden="0" w:uiPriority="64" w:unhideWhenUsed="0"/>
-    <w:lsdException w:name="Medium List 1 Accent 3" w:semiHidden="0" w:uiPriority="65" w:unhideWhenUsed="0"/>
-    <w:lsdException w:name="Medium List 2 Accent 3" w:semiHidden="0" w:uiPriority="66" w:unhideWhenUsed="0"/>
-    <w:lsdException w:name="Medium Grid 1 Accent 3" w:semiHidden="0" w:uiPriority="67" w:unhideWhenUsed="0"/>
-    <w:lsdException w:name="Medium Grid 2 Accent 3" w:semiHidden="0" w:uiPriority="68" w:unhideWhenUsed="0"/>
-    <w:lsdException w:name="Medium Grid 3 Accent 3" w:semiHidden="0" w:uiPriority="69" w:unhideWhenUsed="0"/>
-    <w:lsdException w:name="Dark List Accent 3" w:semiHidden="0" w:uiPriority="70" w:unhideWhenUsed="0"/>
-    <w:lsdException w:name="Colorful Shading Accent 3" w:semiHidden="0" w:uiPriority="71" w:unhideWhenUsed="0"/>
-    <w:lsdException w:name="Colorful List Accent 3" w:semiHidden="0" w:uiPriority="72" w:unhideWhenUsed="0"/>
-    <w:lsdException w:name="Colorful Grid Accent 3" w:semiHidden="0" w:uiPriority="73" w:unhideWhenUsed="0"/>
-    <w:lsdException w:name="Light Shading Accent 4" w:semiHidden="0" w:uiPriority="60" w:unhideWhenUsed="0"/>
-    <w:lsdException w:name="Light List Accent 4" w:semiHidden="0" w:uiPriority="61" w:unhideWhenUsed="0"/>
-    <w:lsdException w:name="Light Grid Accent 4" w:semiHidden="0" w:uiPriority="62" w:unhideWhenUsed="0"/>
-    <w:lsdException w:name="Medium Shading 1 Accent 4" w:semiHidden="0" w:uiPriority="63" w:unhideWhenUsed="0"/>
-    <w:lsdException w:name="Medium Shading 2 Accent 4" w:semiHidden="0" w:uiPriority="64" w:unhideWhenUsed="0"/>
-    <w:lsdException w:name="Medium List 1 Accent 4" w:semiHidden="0" w:uiPriority="65" w:unhideWhenUsed="0"/>
-    <w:lsdException w:name="Medium List 2 Accent 4" w:semiHidden="0" w:uiPriority="66" w:unhideWhenUsed="0"/>
-    <w:lsdException w:name="Medium Grid 1 Accent 4" w:semiHidden="0" w:uiPriority="67" w:unhideWhenUsed="0"/>
-    <w:lsdException w:name="Medium Grid 2 Accent 4" w:semiHidden="0" w:uiPriority="68" w:unhideWhenUsed="0"/>
-    <w:lsdException w:name="Medium Grid 3 Accent 4" w:semiHidden="0" w:uiPriority="69" w:unhideWhenUsed="0"/>
-    <w:lsdException w:name="Dark List Accent 4" w:semiHidden="0" w:uiPriority="70" w:unhideWhenUsed="0"/>
-    <w:lsdException w:name="Colorful Shading Accent 4" w:semiHidden="0" w:uiPriority="71" w:unhideWhenUsed="0"/>
-    <w:lsdException w:name="Colorful List Accent 4" w:semiHidden="0" w:uiPriority="72" w:unhideWhenUsed="0"/>
-    <w:lsdException w:name="Colorful Grid Accent 4" w:semiHidden="0" w:uiPriority="73" w:unhideWhenUsed="0"/>
-    <w:lsdException w:name="Light Shading Accent 5" w:semiHidden="0" w:uiPriority="60" w:unhideWhenUsed="0"/>
-    <w:lsdException w:name="Light List Accent 5" w:semiHidden="0" w:uiPriority="61" w:unhideWhenUsed="0"/>
-    <w:lsdException w:name="Light Grid Accent 5" w:semiHidden="0" w:uiPriority="62" w:unhideWhenUsed="0"/>
-    <w:lsdException w:name="Medium Shading 1 Accent 5" w:semiHidden="0" w:uiPriority="63" w:unhideWhenUsed="0"/>
-    <w:lsdException w:name="Medium Shading 2 Accent 5" w:semiHidden="0" w:uiPriority="64" w:unhideWhenUsed="0"/>
-    <w:lsdException w:name="Medium List 1 Accent 5" w:semiHidden="0" w:uiPriority="65" w:unhideWhenUsed="0"/>
-    <w:lsdException w:name="Medium List 2 Accent 5" w:semiHidden="0" w:uiPriority="66" w:unhideWhenUsed="0"/>
-    <w:lsdException w:name="Medium Grid 1 Accent 5" w:semiHidden="0" w:uiPriority="67" w:unhideWhenUsed="0"/>
-    <w:lsdException w:name="Medium Grid 2 Accent 5" w:semiHidden="0" w:uiPriority="68" w:unhideWhenUsed="0"/>
-    <w:lsdException w:name="Medium Grid 3 Accent 5" w:semiHidden="0" w:uiPriority="69" w:unhideWhenUsed="0"/>
-    <w:lsdException w:name="Dark List Accent 5" w:semiHidden="0" w:uiPriority="70" w:unhideWhenUsed="0"/>
-    <w:lsdException w:name="Colorful Shading Accent 5" w:semiHidden="0" w:uiPriority="71" w:unhideWhenUsed="0"/>
-    <w:lsdException w:name="Colorful List Accent 5" w:semiHidden="0" w:uiPriority="72" w:unhideWhenUsed="0"/>
-    <w:lsdException w:name="Colorful Grid Accent 5" w:semiHidden="0" w:uiPriority="73" w:unhideWhenUsed="0"/>
-    <w:lsdException w:name="Light Shading Accent 6" w:semiHidden="0" w:uiPriority="60" w:unhideWhenUsed="0"/>
-    <w:lsdException w:name="Light List Accent 6" w:semiHidden="0" w:uiPriority="61" w:unhideWhenUsed="0"/>
-    <w:lsdException w:name="Light Grid Accent 6" w:semiHidden="0" w:uiPriority="62" w:unhideWhenUsed="0"/>
-    <w:lsdException w:name="Medium Shading 1 Accent 6" w:semiHidden="0" w:uiPriority="63" w:unhideWhenUsed="0"/>
-    <w:lsdException w:name="Medium Shading 2 Accent 6" w:semiHidden="0" w:uiPriority="64" w:unhideWhenUsed="0"/>
-    <w:lsdException w:name="Medium List 1 Accent 6" w:semiHidden="0" w:uiPriority="65" w:unhideWhenUsed="0"/>
-    <w:lsdException w:name="Medium List 2 Accent 6" w:semiHidden="0" w:uiPriority="66" w:unhideWhenUsed="0"/>
-    <w:lsdException w:name="Medium Grid 1 Accent 6" w:semiHidden="0" w:uiPriority="67" w:unhideWhenUsed="0"/>
-    <w:lsdException w:name="Medium Grid 2 Accent 6" w:semiHidden="0" w:uiPriority="68" w:unhideWhenUsed="0"/>
-    <w:lsdException w:name="Medium Grid 3 Accent 6" w:semiHidden="0" w:uiPriority="69" w:unhideWhenUsed="0"/>
-    <w:lsdException w:name="Dark List Accent 6" w:semiHidden="0" w:uiPriority="70" w:unhideWhenUsed="0"/>
-    <w:lsdException w:name="Colorful Shading Accent 6" w:semiHidden="0" w:uiPriority="71" w:unhideWhenUsed="0"/>
-    <w:lsdException w:name="Colorful List Accent 6" w:semiHidden="0" w:uiPriority="72" w:unhideWhenUsed="0"/>
-    <w:lsdException w:name="Colorful Grid Accent 6" w:semiHidden="0" w:uiPriority="73" w:unhideWhenUsed="0"/>
-    <w:lsdException w:name="Subtle Emphasis" w:semiHidden="0" w:uiPriority="19" w:unhideWhenUsed="0" w:qFormat="1"/>
-    <w:lsdException w:name="Intense Emphasis" w:semiHidden="0" w:uiPriority="21" w:unhideWhenUsed="0" w:qFormat="1"/>
-    <w:lsdException w:name="Subtle Reference" w:semiHidden="0" w:uiPriority="31" w:unhideWhenUsed="0" w:qFormat="1"/>
-    <w:lsdException w:name="Intense Reference" w:semiHidden="0" w:uiPriority="32" w:unhideWhenUsed="0" w:qFormat="1"/>
-    <w:lsdException w:name="Book Title" w:semiHidden="0" w:uiPriority="33" w:unhideWhenUsed="0" w:qFormat="1"/>
-    <w:lsdException w:name="Bibliography" w:uiPriority="37"/>
-    <w:lsdException w:name="TOC Heading" w:uiPriority="39" w:qFormat="1"/>
-  </w:latentStyles>
-  <w:style w:type="paragraph" w:default="1" w:styleId="a">
-    <w:name w:val="Normal"/>
-    <w:qFormat/>
-  </w:style>
-  <w:style w:type="character" w:default="1" w:styleId="a0">
-    <w:name w:val="Default Paragraph Font"/>
-    <w:uiPriority w:val="1"/>
-    <w:semiHidden/>
-    <w:unhideWhenUsed/>
-  </w:style>
-  <w:style w:type="table" w:default="1" w:styleId="a1">
-    <w:name w:val="Normal Table"/>
-    <w:uiPriority w:val="99"/>
-    <w:semiHidden/>
-    <w:unhideWhenUsed/>
-    <w:tblPr>
-      <w:tblInd w:w="0" w:type="dxa"/>
-      <w:tblCellMar>
-        <w:top w:w="0" w:type="dxa"/>
-        <w:left w:w="108" w:type="dxa"/>
-        <w:bottom w:w="0" w:type="dxa"/>
-        <w:right w:w="108" w:type="dxa"/>
-      </w:tblCellMar>
-    </w:tblPr>
-  </w:style>
-  <w:style w:type="numbering" w:default="1" w:styleId="a2">
-    <w:name w:val="No List"/>
-    <w:uiPriority w:val="99"/>
-    <w:semiHidden/>
-    <w:unhideWhenUsed/>
-  </w:style>
-  <w:style w:type="character" w:styleId="a3">
-    <w:name w:val="Placeholder Text"/>
-    <w:basedOn w:val="a0"/>
-    <w:uiPriority w:val="99"/>
-    <w:semiHidden/>
-    <w:rsid w:val="00EC53AF"/>
-    <w:rPr>
-      <w:color w:val="808080"/>
-    </w:rPr>
-  </w:style>
-</w:styles>
-</file>
-
-<file path=word/glossary/stylesWithEffects.xml><?xml version="1.0" encoding="utf-8"?>
-<w:styles xmlns:wpc="http://schemas.microsoft.com/office/word/2010/wordprocessingCanvas" xmlns:mc="http://schemas.openxmlformats.org/markup-compatibility/2006" xmlns:o="urn:schemas-microsoft-com:office:office" xmlns:r="http://schemas.openxmlformats.org/officeDocument/2006/relationships" xmlns:m="http://schemas.openxmlformats.org/officeDocument/2006/math" xmlns:v="urn:schemas-microsoft-com:vml" xmlns:wp14="http://schemas.microsoft.com/office/word/2010/wordprocessingDrawing" xmlns:wp="http://schemas.openxmlformats.org/drawingml/2006/wordprocessingDrawing" xmlns:w10="urn:schemas-microsoft-com:office:word" xmlns:w="http://schemas.openxmlformats.org/wordprocessingml/2006/main" xmlns:w14="http://schemas.microsoft.com/office/word/2010/wordml" xmlns:wpg="http://schemas.microsoft.com/office/word/2010/wordprocessingGroup" xmlns:wpi="http://schemas.microsoft.com/office/word/2010/wordprocessingInk" xmlns:wne="http://schemas.microsoft.com/office/word/2006/wordml" xmlns:wps="http://schemas.microsoft.com/office/word/2010/wordprocessingShape" mc:Ignorable="w14 wp14">
-  <w:docDefaults>
-    <w:rPrDefault>
-      <w:rPr>
-        <w:rFonts w:asciiTheme="minorHAnsi" w:eastAsiaTheme="minorEastAsia" w:hAnsiTheme="minorHAnsi" w:cstheme="minorBidi"/>
-        <w:sz w:val="22"/>
-        <w:szCs w:val="22"/>
-        <w:lang w:val="ru-RU" w:eastAsia="ru-RU" w:bidi="ar-SA"/>
-      </w:rPr>
-    </w:rPrDefault>
-    <w:pPrDefault>
-      <w:pPr>
-        <w:spacing w:after="200" w:line="276" w:lineRule="auto"/>
-      </w:pPr>
-    </w:pPrDefault>
-  </w:docDefaults>
-  <w:latentStyles w:defLockedState="0" w:defUIPriority="99" w:defSemiHidden="1" w:defUnhideWhenUsed="1" w:defQFormat="0" w:count="267">
-    <w:lsdException w:name="Normal" w:semiHidden="0" w:uiPriority="0" w:unhideWhenUsed="0" w:qFormat="1"/>
-    <w:lsdException w:name="heading 1" w:semiHidden="0" w:uiPriority="9" w:unhideWhenUsed="0" w:qFormat="1"/>
-    <w:lsdException w:name="heading 2" w:uiPriority="9" w:qFormat="1"/>
-    <w:lsdException w:name="heading 3" w:uiPriority="9" w:qFormat="1"/>
-    <w:lsdException w:name="heading 4" w:uiPriority="9" w:qFormat="1"/>
-    <w:lsdException w:name="heading 5" w:uiPriority="9" w:qFormat="1"/>
-    <w:lsdException w:name="heading 6" w:uiPriority="9" w:qFormat="1"/>
-    <w:lsdException w:name="heading 7" w:uiPriority="9" w:qFormat="1"/>
-    <w:lsdException w:name="heading 8" w:uiPriority="9" w:qFormat="1"/>
-    <w:lsdException w:name="heading 9" w:uiPriority="9" w:qFormat="1"/>
-    <w:lsdException w:name="toc 1" w:uiPriority="39"/>
-    <w:lsdException w:name="toc 2" w:uiPriority="39"/>
-    <w:lsdException w:name="toc 3" w:uiPriority="39"/>
-    <w:lsdException w:name="toc 4" w:uiPriority="39"/>
-    <w:lsdException w:name="toc 5" w:uiPriority="39"/>
-    <w:lsdException w:name="toc 6" w:uiPriority="39"/>
-    <w:lsdException w:name="toc 7" w:uiPriority="39"/>
-    <w:lsdException w:name="toc 8" w:uiPriority="39"/>
-    <w:lsdException w:name="toc 9" w:uiPriority="39"/>
-    <w:lsdException w:name="caption" w:uiPriority="35" w:qFormat="1"/>
-    <w:lsdException w:name="Title" w:semiHidden="0" w:uiPriority="10" w:unhideWhenUsed="0" w:qFormat="1"/>
-    <w:lsdException w:name="Default Paragraph Font" w:uiPriority="1"/>
-    <w:lsdException w:name="Subtitle" w:semiHidden="0" w:uiPriority="11" w:unhideWhenUsed="0" w:qFormat="1"/>
-    <w:lsdException w:name="Strong" w:semiHidden="0" w:uiPriority="22" w:unhideWhenUsed="0" w:qFormat="1"/>
-    <w:lsdException w:name="Emphasis" w:semiHidden="0" w:uiPriority="20" w:unhideWhenUsed="0" w:qFormat="1"/>
-    <w:lsdException w:name="Table Grid" w:semiHidden="0" w:uiPriority="59" w:unhideWhenUsed="0"/>
-    <w:lsdException w:name="Placeholder Text" w:unhideWhenUsed="0"/>
-    <w:lsdException w:name="No Spacing" w:semiHidden="0" w:uiPriority="1" w:unhideWhenUsed="0" w:qFormat="1"/>
-    <w:lsdException w:name="Light Shading" w:semiHidden="0" w:uiPriority="60" w:unhideWhenUsed="0"/>
-    <w:lsdException w:name="Light List" w:semiHidden="0" w:uiPriority="61" w:unhideWhenUsed="0"/>
-    <w:lsdException w:name="Light Grid" w:semiHidden="0" w:uiPriority="62" w:unhideWhenUsed="0"/>
-    <w:lsdException w:name="Medium Shading 1" w:semiHidden="0" w:uiPriority="63" w:unhideWhenUsed="0"/>
-    <w:lsdException w:name="Medium Shading 2" w:semiHidden="0" w:uiPriority="64" w:unhideWhenUsed="0"/>
-    <w:lsdException w:name="Medium List 1" w:semiHidden="0" w:uiPriority="65" w:unhideWhenUsed="0"/>
-    <w:lsdException w:name="Medium List 2" w:semiHidden="0" w:uiPriority="66" w:unhideWhenUsed="0"/>
-    <w:lsdException w:name="Medium Grid 1" w:semiHidden="0" w:uiPriority="67" w:unhideWhenUsed="0"/>
-    <w:lsdException w:name="Medium Grid 2" w:semiHidden="0" w:uiPriority="68" w:unhideWhenUsed="0"/>
-    <w:lsdException w:name="Medium Grid 3" w:semiHidden="0" w:uiPriority="69" w:unhideWhenUsed="0"/>
-    <w:lsdException w:name="Dark List" w:semiHidden="0" w:uiPriority="70" w:unhideWhenUsed="0"/>
-    <w:lsdException w:name="Colorful Shading" w:semiHidden="0" w:uiPriority="71" w:unhideWhenUsed="0"/>
-    <w:lsdException w:name="Colorful List" w:semiHidden="0" w:uiPriority="72" w:unhideWhenUsed="0"/>
-    <w:lsdException w:name="Colorful Grid" w:semiHidden="0" w:uiPriority="73" w:unhideWhenUsed="0"/>
-    <w:lsdException w:name="Light Shading Accent 1" w:semiHidden="0" w:uiPriority="60" w:unhideWhenUsed="0"/>
-    <w:lsdException w:name="Light List Accent 1" w:semiHidden="0" w:uiPriority="61" w:unhideWhenUsed="0"/>
-    <w:lsdException w:name="Light Grid Accent 1" w:semiHidden="0" w:uiPriority="62" w:unhideWhenUsed="0"/>
-    <w:lsdException w:name="Medium Shading 1 Accent 1" w:semiHidden="0" w:uiPriority="63" w:unhideWhenUsed="0"/>
-    <w:lsdException w:name="Medium Shading 2 Accent 1" w:semiHidden="0" w:uiPriority="64" w:unhideWhenUsed="0"/>
-    <w:lsdException w:name="Medium List 1 Accent 1" w:semiHidden="0" w:uiPriority="65" w:unhideWhenUsed="0"/>
-    <w:lsdException w:name="Revision" w:unhideWhenUsed="0"/>
-    <w:lsdException w:name="List Paragraph" w:semiHidden="0" w:uiPriority="34" w:unhideWhenUsed="0" w:qFormat="1"/>
-    <w:lsdException w:name="Quote" w:semiHidden="0" w:uiPriority="29" w:unhideWhenUsed="0" w:qFormat="1"/>
-    <w:lsdException w:name="Intense Quote" w:semiHidden="0" w:uiPriority="30" w:unhideWhenUsed="0" w:qFormat="1"/>
-    <w:lsdException w:name="Medium List 2 Accent 1" w:semiHidden="0" w:uiPriority="66" w:unhideWhenUsed="0"/>
-    <w:lsdException w:name="Medium Grid 1 Accent 1" w:semiHidden="0" w:uiPriority="67" w:unhideWhenUsed="0"/>
-    <w:lsdException w:name="Medium Grid 2 Accent 1" w:semiHidden="0" w:uiPriority="68" w:unhideWhenUsed="0"/>
-    <w:lsdException w:name="Medium Grid 3 Accent 1" w:semiHidden="0" w:uiPriority="69" w:unhideWhenUsed="0"/>
-    <w:lsdException w:name="Dark List Accent 1" w:semiHidden="0" w:uiPriority="70" w:unhideWhenUsed="0"/>
-    <w:lsdException w:name="Colorful Shading Accent 1" w:semiHidden="0" w:uiPriority="71" w:unhideWhenUsed="0"/>
-    <w:lsdException w:name="Colorful List Accent 1" w:semiHidden="0" w:uiPriority="72" w:unhideWhenUsed="0"/>
-    <w:lsdException w:name="Colorful Grid Accent 1" w:semiHidden="0" w:uiPriority="73" w:unhideWhenUsed="0"/>
-    <w:lsdException w:name="Light Shading Accent 2" w:semiHidden="0" w:uiPriority="60" w:unhideWhenUsed="0"/>
-    <w:lsdException w:name="Light List Accent 2" w:semiHidden="0" w:uiPriority="61" w:unhideWhenUsed="0"/>
-    <w:lsdException w:name="Light Grid Accent 2" w:semiHidden="0" w:uiPriority="62" w:unhideWhenUsed="0"/>
-    <w:lsdException w:name="Medium Shading 1 Accent 2" w:semiHidden="0" w:uiPriority="63" w:unhideWhenUsed="0"/>
-    <w:lsdException w:name="Medium Shading 2 Accent 2" w:semiHidden="0" w:uiPriority="64" w:unhideWhenUsed="0"/>
-    <w:lsdException w:name="Medium List 1 Accent 2" w:semiHidden="0" w:uiPriority="65" w:unhideWhenUsed="0"/>
-    <w:lsdException w:name="Medium List 2 Accent 2" w:semiHidden="0" w:uiPriority="66" w:unhideWhenUsed="0"/>
-    <w:lsdException w:name="Medium Grid 1 Accent 2" w:semiHidden="0" w:uiPriority="67" w:unhideWhenUsed="0"/>
-    <w:lsdException w:name="Medium Grid 2 Accent 2" w:semiHidden="0" w:uiPriority="68" w:unhideWhenUsed="0"/>
-    <w:lsdException w:name="Medium Grid 3 Accent 2" w:semiHidden="0" w:uiPriority="69" w:unhideWhenUsed="0"/>
-    <w:lsdException w:name="Dark List Accent 2" w:semiHidden="0" w:uiPriority="70" w:unhideWhenUsed="0"/>
-    <w:lsdException w:name="Colorful Shading Accent 2" w:semiHidden="0" w:uiPriority="71" w:unhideWhenUsed="0"/>
-    <w:lsdException w:name="Colorful List Accent 2" w:semiHidden="0" w:uiPriority="72" w:unhideWhenUsed="0"/>
-    <w:lsdException w:name="Colorful Grid Accent 2" w:semiHidden="0" w:uiPriority="73" w:unhideWhenUsed="0"/>
-    <w:lsdException w:name="Light Shading Accent 3" w:semiHidden="0" w:uiPriority="60" w:unhideWhenUsed="0"/>
-    <w:lsdException w:name="Light List Accent 3" w:semiHidden="0" w:uiPriority="61" w:unhideWhenUsed="0"/>
-    <w:lsdException w:name="Light Grid Accent 3" w:semiHidden="0" w:uiPriority="62" w:unhideWhenUsed="0"/>
-    <w:lsdException w:name="Medium Shading 1 Accent 3" w:semiHidden="0" w:uiPriority="63" w:unhideWhenUsed="0"/>
-    <w:lsdException w:name="Medium Shading 2 Accent 3" w:semiHidden="0" w:uiPriority="64" w:unhideWhenUsed="0"/>
-    <w:lsdException w:name="Medium List 1 Accent 3" w:semiHidden="0" w:uiPriority="65" w:unhideWhenUsed="0"/>
-    <w:lsdException w:name="Medium List 2 Accent 3" w:semiHidden="0" w:uiPriority="66" w:unhideWhenUsed="0"/>
-    <w:lsdException w:name="Medium Grid 1 Accent 3" w:semiHidden="0" w:uiPriority="67" w:unhideWhenUsed="0"/>
-    <w:lsdException w:name="Medium Grid 2 Accent 3" w:semiHidden="0" w:uiPriority="68" w:unhideWhenUsed="0"/>
-    <w:lsdException w:name="Medium Grid 3 Accent 3" w:semiHidden="0" w:uiPriority="69" w:unhideWhenUsed="0"/>
-    <w:lsdException w:name="Dark List Accent 3" w:semiHidden="0" w:uiPriority="70" w:unhideWhenUsed="0"/>
-    <w:lsdException w:name="Colorful Shading Accent 3" w:semiHidden="0" w:uiPriority="71" w:unhideWhenUsed="0"/>
-    <w:lsdException w:name="Colorful List Accent 3" w:semiHidden="0" w:uiPriority="72" w:unhideWhenUsed="0"/>
-    <w:lsdException w:name="Colorful Grid Accent 3" w:semiHidden="0" w:uiPriority="73" w:unhideWhenUsed="0"/>
-    <w:lsdException w:name="Light Shading Accent 4" w:semiHidden="0" w:uiPriority="60" w:unhideWhenUsed="0"/>
-    <w:lsdException w:name="Light List Accent 4" w:semiHidden="0" w:uiPriority="61" w:unhideWhenUsed="0"/>
-    <w:lsdException w:name="Light Grid Accent 4" w:semiHidden="0" w:uiPriority="62" w:unhideWhenUsed="0"/>
-    <w:lsdException w:name="Medium Shading 1 Accent 4" w:semiHidden="0" w:uiPriority="63" w:unhideWhenUsed="0"/>
-    <w:lsdException w:name="Medium Shading 2 Accent 4" w:semiHidden="0" w:uiPriority="64" w:unhideWhenUsed="0"/>
-    <w:lsdException w:name="Medium List 1 Accent 4" w:semiHidden="0" w:uiPriority="65" w:unhideWhenUsed="0"/>
-    <w:lsdException w:name="Medium List 2 Accent 4" w:semiHidden="0" w:uiPriority="66" w:unhideWhenUsed="0"/>
-    <w:lsdException w:name="Medium Grid 1 Accent 4" w:semiHidden="0" w:uiPriority="67" w:unhideWhenUsed="0"/>
-    <w:lsdException w:name="Medium Grid 2 Accent 4" w:semiHidden="0" w:uiPriority="68" w:unhideWhenUsed="0"/>
-    <w:lsdException w:name="Medium Grid 3 Accent 4" w:semiHidden="0" w:uiPriority="69" w:unhideWhenUsed="0"/>
-    <w:lsdException w:name="Dark List Accent 4" w:semiHidden="0" w:uiPriority="70" w:unhideWhenUsed="0"/>
-    <w:lsdException w:name="Colorful Shading Accent 4" w:semiHidden="0" w:uiPriority="71" w:unhideWhenUsed="0"/>
-    <w:lsdException w:name="Colorful List Accent 4" w:semiHidden="0" w:uiPriority="72" w:unhideWhenUsed="0"/>
-    <w:lsdException w:name="Colorful Grid Accent 4" w:semiHidden="0" w:uiPriority="73" w:unhideWhenUsed="0"/>
-    <w:lsdException w:name="Light Shading Accent 5" w:semiHidden="0" w:uiPriority="60" w:unhideWhenUsed="0"/>
-    <w:lsdException w:name="Light List Accent 5" w:semiHidden="0" w:uiPriority="61" w:unhideWhenUsed="0"/>
-    <w:lsdException w:name="Light Grid Accent 5" w:semiHidden="0" w:uiPriority="62" w:unhideWhenUsed="0"/>
-    <w:lsdException w:name="Medium Shading 1 Accent 5" w:semiHidden="0" w:uiPriority="63" w:unhideWhenUsed="0"/>
-    <w:lsdException w:name="Medium Shading 2 Accent 5" w:semiHidden="0" w:uiPriority="64" w:unhideWhenUsed="0"/>
-    <w:lsdException w:name="Medium List 1 Accent 5" w:semiHidden="0" w:uiPriority="65" w:unhideWhenUsed="0"/>
-    <w:lsdException w:name="Medium List 2 Accent 5" w:semiHidden="0" w:uiPriority="66" w:unhideWhenUsed="0"/>
-    <w:lsdException w:name="Medium Grid 1 Accent 5" w:semiHidden="0" w:uiPriority="67" w:unhideWhenUsed="0"/>
-    <w:lsdException w:name="Medium Grid 2 Accent 5" w:semiHidden="0" w:uiPriority="68" w:unhideWhenUsed="0"/>
-    <w:lsdException w:name="Medium Grid 3 Accent 5" w:semiHidden="0" w:uiPriority="69" w:unhideWhenUsed="0"/>
-    <w:lsdException w:name="Dark List Accent 5" w:semiHidden="0" w:uiPriority="70" w:unhideWhenUsed="0"/>
-    <w:lsdException w:name="Colorful Shading Accent 5" w:semiHidden="0" w:uiPriority="71" w:unhideWhenUsed="0"/>
-    <w:lsdException w:name="Colorful List Accent 5" w:semiHidden="0" w:uiPriority="72" w:unhideWhenUsed="0"/>
-    <w:lsdException w:name="Colorful Grid Accent 5" w:semiHidden="0" w:uiPriority="73" w:unhideWhenUsed="0"/>
-    <w:lsdException w:name="Light Shading Accent 6" w:semiHidden="0" w:uiPriority="60" w:unhideWhenUsed="0"/>
-    <w:lsdException w:name="Light List Accent 6" w:semiHidden="0" w:uiPriority="61" w:unhideWhenUsed="0"/>
-    <w:lsdException w:name="Light Grid Accent 6" w:semiHidden="0" w:uiPriority="62" w:unhideWhenUsed="0"/>
-    <w:lsdException w:name="Medium Shading 1 Accent 6" w:semiHidden="0" w:uiPriority="63" w:unhideWhenUsed="0"/>
-    <w:lsdException w:name="Medium Shading 2 Accent 6" w:semiHidden="0" w:uiPriority="64" w:unhideWhenUsed="0"/>
-    <w:lsdException w:name="Medium List 1 Accent 6" w:semiHidden="0" w:uiPriority="65" w:unhideWhenUsed="0"/>
-    <w:lsdException w:name="Medium List 2 Accent 6" w:semiHidden="0" w:uiPriority="66" w:unhideWhenUsed="0"/>
-    <w:lsdException w:name="Medium Grid 1 Accent 6" w:semiHidden="0" w:uiPriority="67" w:unhideWhenUsed="0"/>
-    <w:lsdException w:name="Medium Grid 2 Accent 6" w:semiHidden="0" w:uiPriority="68" w:unhideWhenUsed="0"/>
-    <w:lsdException w:name="Medium Grid 3 Accent 6" w:semiHidden="0" w:uiPriority="69" w:unhideWhenUsed="0"/>
-    <w:lsdException w:name="Dark List Accent 6" w:semiHidden="0" w:uiPriority="70" w:unhideWhenUsed="0"/>
-    <w:lsdException w:name="Colorful Shading Accent 6" w:semiHidden="0" w:uiPriority="71" w:unhideWhenUsed="0"/>
-    <w:lsdException w:name="Colorful List Accent 6" w:semiHidden="0" w:uiPriority="72" w:unhideWhenUsed="0"/>
-    <w:lsdException w:name="Colorful Grid Accent 6" w:semiHidden="0" w:uiPriority="73" w:unhideWhenUsed="0"/>
-    <w:lsdException w:name="Subtle Emphasis" w:semiHidden="0" w:uiPriority="19" w:unhideWhenUsed="0" w:qFormat="1"/>
-    <w:lsdException w:name="Intense Emphasis" w:semiHidden="0" w:uiPriority="21" w:unhideWhenUsed="0" w:qFormat="1"/>
-    <w:lsdException w:name="Subtle Reference" w:semiHidden="0" w:uiPriority="31" w:unhideWhenUsed="0" w:qFormat="1"/>
-    <w:lsdException w:name="Intense Reference" w:semiHidden="0" w:uiPriority="32" w:unhideWhenUsed="0" w:qFormat="1"/>
-    <w:lsdException w:name="Book Title" w:semiHidden="0" w:uiPriority="33" w:unhideWhenUsed="0" w:qFormat="1"/>
-    <w:lsdException w:name="Bibliography" w:uiPriority="37"/>
-    <w:lsdException w:name="TOC Heading" w:uiPriority="39" w:qFormat="1"/>
-  </w:latentStyles>
-  <w:style w:type="paragraph" w:default="1" w:styleId="a">
-    <w:name w:val="Normal"/>
-    <w:qFormat/>
-  </w:style>
-  <w:style w:type="character" w:default="1" w:styleId="a0">
-    <w:name w:val="Default Paragraph Font"/>
-    <w:uiPriority w:val="1"/>
-    <w:semiHidden/>
-    <w:unhideWhenUsed/>
-  </w:style>
-  <w:style w:type="table" w:default="1" w:styleId="a1">
-    <w:name w:val="Normal Table"/>
-    <w:uiPriority w:val="99"/>
-    <w:semiHidden/>
-    <w:unhideWhenUsed/>
-    <w:tblPr>
-      <w:tblInd w:w="0" w:type="dxa"/>
-      <w:tblCellMar>
-        <w:top w:w="0" w:type="dxa"/>
-        <w:left w:w="108" w:type="dxa"/>
-        <w:bottom w:w="0" w:type="dxa"/>
-        <w:right w:w="108" w:type="dxa"/>
-      </w:tblCellMar>
-    </w:tblPr>
-  </w:style>
-  <w:style w:type="numbering" w:default="1" w:styleId="a2">
-    <w:name w:val="No List"/>
-    <w:uiPriority w:val="99"/>
-    <w:semiHidden/>
-    <w:unhideWhenUsed/>
-  </w:style>
-  <w:style w:type="character" w:styleId="a3">
-    <w:name w:val="Placeholder Text"/>
-    <w:basedOn w:val="a0"/>
-    <w:uiPriority w:val="99"/>
-    <w:semiHidden/>
-    <w:rsid w:val="00EC53AF"/>
-    <w:rPr>
-      <w:color w:val="808080"/>
-    </w:rPr>
-  </w:style>
-</w:styles>
-</file>
-
-<file path=word/glossary/webSettings.xml><?xml version="1.0" encoding="utf-8"?>
-<w:webSettings xmlns:mc="http://schemas.openxmlformats.org/markup-compatibility/2006" xmlns:r="http://schemas.openxmlformats.org/officeDocument/2006/relationships" xmlns:w="http://schemas.openxmlformats.org/wordprocessingml/2006/main" xmlns:w14="http://schemas.microsoft.com/office/word/2010/wordml" mc:Ignorable="w14">
-  <w:optimizeForBrowser/>
-  <w:allowPNG/>
-</w:webSettings>
-</file>
-
 <file path=word/theme/theme1.xml><?xml version="1.0" encoding="utf-8"?>
 <a:theme xmlns:a="http://schemas.openxmlformats.org/drawingml/2006/main" name="Тема Office">
   <a:themeElements>
@@ -22948,7 +20778,7 @@
 </file>
 
 <file path=customXml/itemProps1.xml><?xml version="1.0" encoding="utf-8"?>
-<ds:datastoreItem xmlns:ds="http://schemas.openxmlformats.org/officeDocument/2006/customXml" ds:itemID="{69A2D284-F225-4A61-90C5-502AED6F48A5}">
+<ds:datastoreItem xmlns:ds="http://schemas.openxmlformats.org/officeDocument/2006/customXml" ds:itemID="{E1B9A3F4-7D74-4614-BBED-D635BC1B386A}">
   <ds:schemaRefs>
     <ds:schemaRef ds:uri="http://schemas.openxmlformats.org/officeDocument/2006/bibliography"/>
   </ds:schemaRefs>

</xml_diff>

<commit_message>
add radar_test in docx
</commit_message>
<xml_diff>
--- a/src/Черновик.docx
+++ b/src/Черновик.docx
@@ -14813,6 +14813,9 @@
           <w:bottom w:val="single" w:sz="4" w:space="1" w:color="auto"/>
           <w:right w:val="single" w:sz="4" w:space="1" w:color="auto"/>
         </w:pBdr>
+        <w:rPr>
+          <w:lang w:val="ru-RU"/>
+        </w:rPr>
       </w:pPr>
       <w:r>
         <w:t xml:space="preserve">        </w:t>
@@ -14923,34 +14926,47 @@
       <w:r>
         <w:rPr>
           <w:color w:val="098658"/>
+          <w:lang w:val="ru-RU"/>
         </w:rPr>
         <w:t>1</w:t>
       </w:r>
       <w:r>
+        <w:rPr>
+          <w:lang w:val="ru-RU"/>
+        </w:rPr>
         <w:t xml:space="preserve"> </w:t>
       </w:r>
       <w:r>
         <w:rPr>
           <w:color w:val="000000"/>
+          <w:lang w:val="ru-RU"/>
         </w:rPr>
         <w:t>:</w:t>
       </w:r>
       <w:r>
+        <w:rPr>
+          <w:lang w:val="ru-RU"/>
+        </w:rPr>
         <w:t xml:space="preserve"> </w:t>
       </w:r>
       <w:r>
         <w:rPr>
           <w:color w:val="000000"/>
+          <w:lang w:val="ru-RU"/>
         </w:rPr>
         <w:t>-</w:t>
       </w:r>
       <w:r>
         <w:rPr>
           <w:color w:val="098658"/>
+          <w:lang w:val="ru-RU"/>
         </w:rPr>
         <w:t>1</w:t>
       </w:r>
       <w:r>
+        <w:rPr>
+          <w:lang w:val="ru-RU"/>
+        </w:rPr>
         <w:t>);</w:t>
       </w:r>
     </w:p>
@@ -14971,12 +14987,18 @@
         <w:t> </w:t>
       </w:r>
       <w:r>
+        <w:rPr>
+          <w:lang w:val="ru-RU"/>
+        </w:rPr>
         <w:t xml:space="preserve"> </w:t>
       </w:r>
       <w:r>
         <w:t> </w:t>
       </w:r>
       <w:r>
+        <w:rPr>
+          <w:lang w:val="ru-RU"/>
+        </w:rPr>
         <w:t xml:space="preserve"> </w:t>
       </w:r>
       <w:r>
@@ -17544,7 +17566,7 @@
     </w:p>
     <w:p>
       <w:r>
-        <w:t xml:space="preserve">Для проведения имитационного моделирования и статистического анализа эффективности последовательностей Шапиро, используется ноутбук </w:t>
+        <w:t xml:space="preserve">Для оценки практической эффективности последовательностей Шапиро было проведено имитационное моделирование процесса радиолокационного обнаружения, описанное в ноутбуке </w:t>
       </w:r>
       <w:proofErr w:type="spellStart"/>
       <w:r>
@@ -17552,139 +17574,354 @@
       </w:r>
       <w:proofErr w:type="spellEnd"/>
       <w:r>
-        <w:t xml:space="preserve">. Здесь смоделирован тест для практической проверки того, как последовательности, построенные на основе многочленов </w:t>
-      </w:r>
+        <w:t>.</w:t>
+      </w:r>
+    </w:p>
+    <w:p>
       <w:r>
         <w:lastRenderedPageBreak/>
-        <w:t>Шапиро, ведут себя в условиях, близких к работе радиолокационной системы. Основная цель – понять, насколько эти последовательности позволяют лучше выделять отражённые сигналы на фоне шума и мешающих факторов, а также оценить их преимущества перед случайными или другими известными последовательностями.</w:t>
-      </w:r>
-    </w:p>
-    <w:p>
-      <w:r>
-        <w:t>Для тестов используются две последовательности – случайная и Шапиро длины 32.</w:t>
-      </w:r>
-    </w:p>
-    <w:p>
-      <w:r>
-        <w:t>Построение модели радара. Создаётся функция, которая имитирует прохождение сигнала от радара до цели и обратно. Последовательность кодируется в виде коротких импульсов, где +1 и -1 обозначают фазы сигнала. Сначала формируется исходный сигнал — это то, что излучает антенна. Затем создаётся копия этого сигнала с определённой задержкой, соответствующей расстоянию до цели, и добавляется белый гауссов шум, моделирующий реальные помехи. Итоговый сигнал — это сумма исходного, отражённого и шумового компонентов.</w:t>
-      </w:r>
-    </w:p>
-    <w:p/>
-    <w:p>
-      <w:r>
-        <w:t xml:space="preserve">Чтобы оценить, как хорошо последовательность позволяет обнаружить отражение, используется корреляционный анализ. При помощи функции </w:t>
-      </w:r>
-      <w:proofErr w:type="spellStart"/>
-      <w:r>
-        <w:t>numpy.correlate</w:t>
-      </w:r>
-      <w:proofErr w:type="spellEnd"/>
-      <w:r>
-        <w:t xml:space="preserve"> или </w:t>
-      </w:r>
-      <w:proofErr w:type="spellStart"/>
-      <w:r>
-        <w:t>scipy.signal.correlate</w:t>
-      </w:r>
-      <w:proofErr w:type="spellEnd"/>
-      <w:r>
-        <w:t xml:space="preserve"> вычисляется кросс-корреляция принятого сигнала </w:t>
+        <w:t>Сигналы проходили через модель канала, в котором учитывались различные реальные факторы: наличие аддитивного шума, возможное ослабление отражённого сигнала, а также частичное наложение сигналов при многолучевом распространении.</w:t>
+      </w:r>
+    </w:p>
+    <w:p>
+      <w:r>
+        <w:t>В ходе моделирования рассматривалось пять целей, находящихся на различных расстояниях. Каждая цель отражала часть посланного импульса, при этом задержки сигналов варьировались в диапазоне от 0.001 до 0.01 миллисекунды, что соответствует различным дальностям. Амплитуды отражений также изменялись случайным образом от 0.4 до 1.0, что моделировало различную интенсивность отражённых сигналов. Для каждого теста формировалась серия из шести импульсов, а частота дискретизации выбиралась случайно в диапазоне от 5 до 50 мегагерц</w:t>
       </w:r>
       <w:proofErr w:type="gramStart"/>
       <w:r>
-        <w:t>с</w:t>
+        <w:t>.</w:t>
       </w:r>
       <w:proofErr w:type="gramEnd"/>
       <w:r>
-        <w:t xml:space="preserve"> исходным. На выходе получаем корреляционный отклик: если последовательность обладает хорошими свойствами, на графике будет ярко выраженный пик, соответствующий задержке отражённого сигнала, а остальные значения будут малы — это и есть низкий уровень боковых пиков.</w:t>
-      </w:r>
-    </w:p>
-    <w:p/>
-    <w:p>
-      <w:r>
-        <w:t xml:space="preserve">Затем ноутбук проводит серию экспериментов, варьируя параметры: длину последовательности (например, 63, 127, 255, 511), уровень шума (измеряемый как отношение сигнал/шум, SNR), и количество моделируемых целей (одна или несколько). Для каждой комбинации выполняется несколько десятков или сотен итераций с разными случайными шумами. После этого вычисляется вероятность правильного обнаружения (доля случаев, где корреляционный пик </w:t>
-      </w:r>
-      <w:r>
-        <w:lastRenderedPageBreak/>
-        <w:t>превышает порог) и вероятность ложной тревоги (когда шум даёт ложный пик). Результаты усредняются и сохраняются для построения графиков зависимости вероятности обнаружения от уровня шума.</w:t>
-      </w:r>
-    </w:p>
-    <w:p/>
-    <w:p>
-      <w:r>
-        <w:t>В визуальной части ноутбук строит три основных типа графиков. Первый — форма принятого сигнала, где видна структура исходного, отражённого и шумового компонентов. Второй — график корреляционного отклика, показывающий расположение основного и боковых пиков. Третий — статистические кривые, отображающие эффективность последовательностей при разных значениях SNR: на них видно, что последовательности Шапиро обеспечивают более резкий и стабильный корреляционный пик даже при низких уровнях сигнала.</w:t>
-      </w:r>
-    </w:p>
-    <w:p/>
-    <w:p>
-      <w:r>
-        <w:t>Помимо моделирования одиночного отражения, в некоторых блоках ноутбука рассматриваются сценарии с несколькими целями. Для этого к принятому сигналу добавляется вторая копия исходной последовательности с другой задержкой и ослаблением. Таким образом, можно оценить способность последовательностей различать близкие по времени отклики. В таких случаях последовательности Шапиро показывают меньшую взаимную корреляцию между отражениями и более точное разделение целей.</w:t>
-      </w:r>
-    </w:p>
-    <w:p/>
-    <w:p>
-      <w:r>
-        <w:t>Для статистического анализа в конце ноутбука используется серия функций, которые собирают данные по множеству экспериментов и вычисляют средние, дисперсии и строят гистограммы. Отдельно рассчитывается распределение корреляционных пиков для каждой последовательности, оцениваются медианные значения и доверительные интервалы. Эти результаты сохраняются в файлы формата CSV, которые позже используются для построения итоговых графиков эффективности.</w:t>
-      </w:r>
-    </w:p>
-    <w:p/>
-    <w:p>
+        <w:t xml:space="preserve"> В канал вносился белый шум с</w:t>
+      </w:r>
+      <w:r>
+        <w:t xml:space="preserve"> </w:t>
+      </w:r>
+      <w:r>
+        <w:t xml:space="preserve">нормальным распределением, </w:t>
+      </w:r>
+      <w:r>
+        <w:t>для имитации</w:t>
+      </w:r>
+      <w:r>
+        <w:t xml:space="preserve"> </w:t>
+      </w:r>
+      <w:proofErr w:type="gramStart"/>
+      <w:r>
+        <w:t>реальных</w:t>
+      </w:r>
+      <w:proofErr w:type="gramEnd"/>
+      <w:r>
+        <w:t xml:space="preserve"> </w:t>
+      </w:r>
+      <w:r>
+        <w:t>условия приёма сигнала</w:t>
+      </w:r>
+      <w:r>
+        <w:t>.</w:t>
+      </w:r>
+    </w:p>
+    <w:p>
+      <w:r>
+        <w:t>Всего было проведено 100 000 независимых испытаний, в каждом из которых выполнялось обнаружение целей по принятому сигналу. В процессе моделирования подбирался оптимальный порог, при котором совокупная ошибка распознавания минимизируется. После завершения всех прогонов были усреднены основные показатели эффективности для последовательностей Шапиро и</w:t>
+      </w:r>
+      <w:r>
+        <w:t xml:space="preserve"> случайных последовательностей.</w:t>
+      </w:r>
+    </w:p>
+    <w:p>
+      <w:r>
+        <w:t>Результаты моделирования представлены в таблице.</w:t>
+      </w:r>
       <w:bookmarkStart w:id="14" w:name="_GoBack"/>
       <w:bookmarkEnd w:id="14"/>
     </w:p>
     <w:p>
+      <w:pPr>
+        <w:spacing w:before="240" w:line="240" w:lineRule="auto"/>
+        <w:ind w:firstLine="0"/>
+        <w:jc w:val="center"/>
+        <w:rPr>
+          <w:szCs w:val="28"/>
+        </w:rPr>
+      </w:pPr>
+      <w:r>
+        <w:rPr>
+          <w:szCs w:val="28"/>
+        </w:rPr>
+        <w:t>Таблица 1. Р</w:t>
+      </w:r>
+      <w:r>
+        <w:rPr>
+          <w:szCs w:val="28"/>
+        </w:rPr>
+        <w:t>езультаты моделирования радиолокационного обнаружения</w:t>
+      </w:r>
+    </w:p>
+    <w:tbl>
+      <w:tblPr>
+        <w:tblStyle w:val="af4"/>
+        <w:tblW w:w="0" w:type="auto"/>
+        <w:tblLook w:val="04A0" w:firstRow="1" w:lastRow="0" w:firstColumn="1" w:lastColumn="0" w:noHBand="0" w:noVBand="1"/>
+      </w:tblPr>
+      <w:tblGrid>
+        <w:gridCol w:w="3284"/>
+        <w:gridCol w:w="3285"/>
+        <w:gridCol w:w="3285"/>
+      </w:tblGrid>
+      <w:tr>
+        <w:tc>
+          <w:tcPr>
+            <w:tcW w:w="3284" w:type="dxa"/>
+            <w:vAlign w:val="center"/>
+          </w:tcPr>
+          <w:p>
+            <w:pPr>
+              <w:spacing w:line="240" w:lineRule="auto"/>
+              <w:ind w:firstLine="0"/>
+              <w:jc w:val="center"/>
+            </w:pPr>
+          </w:p>
+        </w:tc>
+        <w:tc>
+          <w:tcPr>
+            <w:tcW w:w="3285" w:type="dxa"/>
+            <w:vAlign w:val="center"/>
+          </w:tcPr>
+          <w:p>
+            <w:pPr>
+              <w:spacing w:line="240" w:lineRule="auto"/>
+              <w:ind w:firstLine="0"/>
+              <w:jc w:val="center"/>
+            </w:pPr>
+            <w:r>
+              <w:t>Последовательность Шапиро</w:t>
+            </w:r>
+          </w:p>
+        </w:tc>
+        <w:tc>
+          <w:tcPr>
+            <w:tcW w:w="3285" w:type="dxa"/>
+            <w:vAlign w:val="center"/>
+          </w:tcPr>
+          <w:p>
+            <w:pPr>
+              <w:spacing w:line="240" w:lineRule="auto"/>
+              <w:ind w:firstLine="0"/>
+              <w:jc w:val="center"/>
+            </w:pPr>
+            <w:r>
+              <w:t>Последовательность Шапиро</w:t>
+            </w:r>
+          </w:p>
+        </w:tc>
+      </w:tr>
+      <w:tr>
+        <w:tc>
+          <w:tcPr>
+            <w:tcW w:w="3284" w:type="dxa"/>
+            <w:vAlign w:val="center"/>
+          </w:tcPr>
+          <w:p>
+            <w:pPr>
+              <w:spacing w:line="240" w:lineRule="auto"/>
+              <w:ind w:firstLine="0"/>
+              <w:jc w:val="center"/>
+            </w:pPr>
+            <w:r>
+              <w:t>Среднее число верных обнаружений</w:t>
+            </w:r>
+          </w:p>
+        </w:tc>
+        <w:tc>
+          <w:tcPr>
+            <w:tcW w:w="3285" w:type="dxa"/>
+            <w:vAlign w:val="center"/>
+          </w:tcPr>
+          <w:p>
+            <w:pPr>
+              <w:spacing w:line="240" w:lineRule="auto"/>
+              <w:ind w:firstLine="0"/>
+              <w:jc w:val="center"/>
+            </w:pPr>
+            <w:r>
+              <w:t>25.045</w:t>
+            </w:r>
+          </w:p>
+        </w:tc>
+        <w:tc>
+          <w:tcPr>
+            <w:tcW w:w="3285" w:type="dxa"/>
+            <w:vAlign w:val="center"/>
+          </w:tcPr>
+          <w:p>
+            <w:pPr>
+              <w:spacing w:line="240" w:lineRule="auto"/>
+              <w:ind w:firstLine="0"/>
+              <w:jc w:val="center"/>
+            </w:pPr>
+            <w:r>
+              <w:t>23.577</w:t>
+            </w:r>
+          </w:p>
+        </w:tc>
+      </w:tr>
+      <w:tr>
+        <w:tc>
+          <w:tcPr>
+            <w:tcW w:w="3284" w:type="dxa"/>
+            <w:vAlign w:val="center"/>
+          </w:tcPr>
+          <w:p>
+            <w:pPr>
+              <w:spacing w:line="240" w:lineRule="auto"/>
+              <w:ind w:firstLine="0"/>
+              <w:jc w:val="center"/>
+            </w:pPr>
+            <w:r>
+              <w:t>Среднее число пропусков</w:t>
+            </w:r>
+          </w:p>
+        </w:tc>
+        <w:tc>
+          <w:tcPr>
+            <w:tcW w:w="3285" w:type="dxa"/>
+            <w:vAlign w:val="center"/>
+          </w:tcPr>
+          <w:p>
+            <w:pPr>
+              <w:spacing w:line="240" w:lineRule="auto"/>
+              <w:ind w:firstLine="0"/>
+              <w:jc w:val="center"/>
+            </w:pPr>
+            <w:r>
+              <w:t>4.955</w:t>
+            </w:r>
+          </w:p>
+        </w:tc>
+        <w:tc>
+          <w:tcPr>
+            <w:tcW w:w="3285" w:type="dxa"/>
+            <w:vAlign w:val="center"/>
+          </w:tcPr>
+          <w:p>
+            <w:pPr>
+              <w:spacing w:line="240" w:lineRule="auto"/>
+              <w:ind w:firstLine="0"/>
+              <w:jc w:val="center"/>
+            </w:pPr>
+            <w:r>
+              <w:t>6.423</w:t>
+            </w:r>
+          </w:p>
+        </w:tc>
+      </w:tr>
+      <w:tr>
+        <w:tc>
+          <w:tcPr>
+            <w:tcW w:w="3284" w:type="dxa"/>
+            <w:vAlign w:val="center"/>
+          </w:tcPr>
+          <w:p>
+            <w:pPr>
+              <w:spacing w:line="240" w:lineRule="auto"/>
+              <w:ind w:firstLine="0"/>
+              <w:jc w:val="center"/>
+            </w:pPr>
+            <w:r>
+              <w:t>Среднее число ложных срабатываний</w:t>
+            </w:r>
+          </w:p>
+        </w:tc>
+        <w:tc>
+          <w:tcPr>
+            <w:tcW w:w="3285" w:type="dxa"/>
+            <w:vAlign w:val="center"/>
+          </w:tcPr>
+          <w:p>
+            <w:pPr>
+              <w:spacing w:line="240" w:lineRule="auto"/>
+              <w:ind w:firstLine="0"/>
+              <w:jc w:val="center"/>
+            </w:pPr>
+            <w:r>
+              <w:t>33.616</w:t>
+            </w:r>
+          </w:p>
+        </w:tc>
+        <w:tc>
+          <w:tcPr>
+            <w:tcW w:w="3285" w:type="dxa"/>
+            <w:vAlign w:val="center"/>
+          </w:tcPr>
+          <w:p>
+            <w:pPr>
+              <w:spacing w:line="240" w:lineRule="auto"/>
+              <w:ind w:firstLine="0"/>
+              <w:jc w:val="center"/>
+            </w:pPr>
+            <w:r>
+              <w:t>49.945</w:t>
+            </w:r>
+          </w:p>
+        </w:tc>
+      </w:tr>
+    </w:tbl>
+    <w:p/>
+    <w:p>
       <w:r>
         <w:lastRenderedPageBreak/>
-        <w:t xml:space="preserve">Что касается связи с C++-частью, она реализована через сохранённые файлы последовательностей. На стороне C++ класс </w:t>
+        <w:t xml:space="preserve">Несмотря на </w:t>
+      </w:r>
+      <w:proofErr w:type="gramStart"/>
+      <w:r>
+        <w:t>то</w:t>
+      </w:r>
+      <w:proofErr w:type="gramEnd"/>
+      <w:r>
+        <w:t xml:space="preserve"> что абсолютное число ложных обнаружений превышает число верных, данный результат обусловлен спецификой моделирования: в каждом испытании число потенциальных шумовых откликов значительно превышает количество реальных целей, а порог обнаружения выбирался таким образом, чтобы минимизировать суммарную ошибку, не исключая слабые сигналы.</w:t>
+      </w:r>
+    </w:p>
+    <w:p>
+      <w:r>
+        <w:t>Последовательность</w:t>
+      </w:r>
+      <w:r>
+        <w:t xml:space="preserve"> Шапиро </w:t>
+      </w:r>
+      <w:r>
+        <w:t>имеет</w:t>
+      </w:r>
+      <w:r>
+        <w:t xml:space="preserve"> небольшое преимущество по количеству верных обнаружений и пропусков по сравнению со с</w:t>
+      </w:r>
+      <w:r>
+        <w:t>лучайными последовательностями</w:t>
+      </w:r>
+      <w:r>
+        <w:t xml:space="preserve">; </w:t>
+      </w:r>
+      <w:r>
+        <w:t>наиболее выраженное различие наблюдается по числу ложных срабатываний. Последовательности Шапиро демонстрируют существенно меньший уровень ложных обнаружений, что соответствует их теоретически низкой боковой автокорреляции и подтверждает их эффективность в задачах радио</w:t>
+      </w:r>
+      <w:r>
+        <w:t>локационного обнаружения.</w:t>
+      </w:r>
+    </w:p>
+    <w:p>
+      <w:r>
+        <w:t xml:space="preserve">Подробная методика моделирования, параметры эксперимента и код реализации приведены в файле </w:t>
       </w:r>
       <w:proofErr w:type="spellStart"/>
       <w:r>
-        <w:t>LittlewoodPolynomial</w:t>
+        <w:t>radar_echo_simulation.ipynb</w:t>
       </w:r>
       <w:proofErr w:type="spellEnd"/>
       <w:r>
-        <w:t xml:space="preserve"> генерирует последовательности (случайные и Шапиро), класс </w:t>
-      </w:r>
-      <w:proofErr w:type="spellStart"/>
-      <w:r>
-        <w:t>Autocorrelation</w:t>
-      </w:r>
-      <w:proofErr w:type="spellEnd"/>
-      <w:r>
-        <w:t xml:space="preserve"> проверяет их корреляционные свойства и при необходимости сохраняет вычисленные данные, а класс </w:t>
-      </w:r>
-      <w:proofErr w:type="spellStart"/>
-      <w:r>
-        <w:t>Tester</w:t>
-      </w:r>
-      <w:proofErr w:type="spellEnd"/>
-      <w:r>
-        <w:t xml:space="preserve"> используется для измерения времени и записи результатов. </w:t>
-      </w:r>
-      <w:proofErr w:type="spellStart"/>
-      <w:r>
-        <w:t>Python</w:t>
-      </w:r>
-      <w:proofErr w:type="spellEnd"/>
-      <w:r>
-        <w:t xml:space="preserve">-ноутбук работает уже с этими данными, используя их в качестве входа для моделирования реального радиолокационного сценария. Таким образом, можно сказать, что C++ часть обеспечивает математическую и алгоритмическую базу, а </w:t>
-      </w:r>
-      <w:proofErr w:type="spellStart"/>
-      <w:r>
-        <w:t>Python</w:t>
-      </w:r>
-      <w:proofErr w:type="spellEnd"/>
-      <w:r>
-        <w:t xml:space="preserve"> часть — статистическую и визуальную проверку свойств.</w:t>
-      </w:r>
-    </w:p>
-    <w:p/>
-    <w:p>
-      <w:r>
-        <w:t>Итог моделирования подтверждает выводы теоретической части: последовательности Шапиро демонстрируют устойчивость к шуму, дают узкий и чёткий корреляционный пик, а их боковые пики значительно ниже, чем у случайных последовательностей. Это делает их подходящими для систем, где важно точное определение задержки отражённого сигнала — например, в радиолокации, навигации и цифровой связи.</w:t>
-      </w:r>
-    </w:p>
-    <w:p/>
+        <w:t>.</w:t>
+      </w:r>
+    </w:p>
     <w:p>
       <w:r>
         <w:br w:type="page"/>
@@ -18305,7 +18542,7 @@
           <w:rPr>
             <w:noProof/>
           </w:rPr>
-          <w:t>17</w:t>
+          <w:t>18</w:t>
         </w:r>
         <w:r>
           <w:fldChar w:fldCharType="end"/>
@@ -20917,7 +21154,7 @@
 </file>
 
 <file path=customXml/itemProps1.xml><?xml version="1.0" encoding="utf-8"?>
-<ds:datastoreItem xmlns:ds="http://schemas.openxmlformats.org/officeDocument/2006/customXml" ds:itemID="{F0501097-D0A0-4991-BDB3-5FB45B3BAF59}">
+<ds:datastoreItem xmlns:ds="http://schemas.openxmlformats.org/officeDocument/2006/customXml" ds:itemID="{29AC45F8-7A76-497E-8020-A21ED36BEE67}">
   <ds:schemaRefs>
     <ds:schemaRef ds:uri="http://schemas.openxmlformats.org/officeDocument/2006/bibliography"/>
   </ds:schemaRefs>

</xml_diff>